<commit_message>
CFA y .zip [2.0]
</commit_message>
<xml_diff>
--- a/fuentes/CFA_02_12210556_DU.docx
+++ b/fuentes/CFA_02_12210556_DU.docx
@@ -23,7 +23,7 @@
             <wp:docPr id="6" name="Imagen 2">
               <a:extLst xmlns:a="http://schemas.openxmlformats.org/drawingml/2006/main">
                 <a:ext uri="{C183D7F6-B498-43B3-948B-1728B52AA6E4}">
-                  <adec:decorative xmlns="" xmlns:cx="http://schemas.microsoft.com/office/drawing/2014/chartex" xmlns:cx1="http://schemas.microsoft.com/office/drawing/2015/9/8/chartex" xmlns:cx2="http://schemas.microsoft.com/office/drawing/2015/10/21/chartex" xmlns:cx3="http://schemas.microsoft.com/office/drawing/2016/5/9/chartex" xmlns:cx4="http://schemas.microsoft.com/office/drawing/2016/5/10/chartex" xmlns:cx5="http://schemas.microsoft.com/office/drawing/2016/5/11/chartex" xmlns:cx6="http://schemas.microsoft.com/office/drawing/2016/5/12/chartex" xmlns:cx7="http://schemas.microsoft.com/office/drawing/2016/5/13/chartex" xmlns:cx8="http://schemas.microsoft.com/office/drawing/2016/5/14/chartex" xmlns:aink="http://schemas.microsoft.com/office/drawing/2016/ink" xmlns:am3d="http://schemas.microsoft.com/office/drawing/2017/model3d" xmlns:o="urn:schemas-microsoft-com:office:office" xmlns:v="urn:schemas-microsoft-com:vml" xmlns:w10="urn:schemas-microsoft-com:office:word" xmlns:w="http://schemas.openxmlformats.org/wordprocessingml/2006/main" xmlns:w16cid="http://schemas.microsoft.com/office/word/2016/wordml/cid" xmlns:w16se="http://schemas.microsoft.com/office/word/2015/wordml/symex" xmlns:adec="http://schemas.microsoft.com/office/drawing/2017/decorative" val="1"/>
+                  <adec:decorative xmlns:adec="http://schemas.microsoft.com/office/drawing/2017/decorative" xmlns:w16se="http://schemas.microsoft.com/office/word/2015/wordml/symex" xmlns:w16cid="http://schemas.microsoft.com/office/word/2016/wordml/cid" xmlns:w="http://schemas.openxmlformats.org/wordprocessingml/2006/main" xmlns:w10="urn:schemas-microsoft-com:office:word" xmlns:v="urn:schemas-microsoft-com:vml" xmlns:o="urn:schemas-microsoft-com:office:office" xmlns:am3d="http://schemas.microsoft.com/office/drawing/2017/model3d" xmlns:aink="http://schemas.microsoft.com/office/drawing/2016/ink" xmlns:cx8="http://schemas.microsoft.com/office/drawing/2016/5/14/chartex" xmlns:cx7="http://schemas.microsoft.com/office/drawing/2016/5/13/chartex" xmlns:cx6="http://schemas.microsoft.com/office/drawing/2016/5/12/chartex" xmlns:cx5="http://schemas.microsoft.com/office/drawing/2016/5/11/chartex" xmlns:cx4="http://schemas.microsoft.com/office/drawing/2016/5/10/chartex" xmlns:cx3="http://schemas.microsoft.com/office/drawing/2016/5/9/chartex" xmlns:cx2="http://schemas.microsoft.com/office/drawing/2015/10/21/chartex" xmlns:cx1="http://schemas.microsoft.com/office/drawing/2015/9/8/chartex" xmlns:cx="http://schemas.microsoft.com/office/drawing/2014/chartex" xmlns="" val="1"/>
                 </a:ext>
               </a:extLst>
             </wp:docPr>
@@ -151,7 +151,7 @@
                 <wp:docPr id="4" name="Rectángulo 4">
                   <a:extLst xmlns:a="http://schemas.openxmlformats.org/drawingml/2006/main">
                     <a:ext uri="{C183D7F6-B498-43B3-948B-1728B52AA6E4}">
-                      <adec:decorative xmlns="" xmlns:cx="http://schemas.microsoft.com/office/drawing/2014/chartex" xmlns:cx1="http://schemas.microsoft.com/office/drawing/2015/9/8/chartex" xmlns:cx2="http://schemas.microsoft.com/office/drawing/2015/10/21/chartex" xmlns:cx3="http://schemas.microsoft.com/office/drawing/2016/5/9/chartex" xmlns:cx4="http://schemas.microsoft.com/office/drawing/2016/5/10/chartex" xmlns:cx5="http://schemas.microsoft.com/office/drawing/2016/5/11/chartex" xmlns:cx6="http://schemas.microsoft.com/office/drawing/2016/5/12/chartex" xmlns:cx7="http://schemas.microsoft.com/office/drawing/2016/5/13/chartex" xmlns:cx8="http://schemas.microsoft.com/office/drawing/2016/5/14/chartex" xmlns:aink="http://schemas.microsoft.com/office/drawing/2016/ink" xmlns:am3d="http://schemas.microsoft.com/office/drawing/2017/model3d" xmlns:o="urn:schemas-microsoft-com:office:office" xmlns:v="urn:schemas-microsoft-com:vml" xmlns:w10="urn:schemas-microsoft-com:office:word" xmlns:w="http://schemas.openxmlformats.org/wordprocessingml/2006/main" xmlns:w16cid="http://schemas.microsoft.com/office/word/2016/wordml/cid" xmlns:w16se="http://schemas.microsoft.com/office/word/2015/wordml/symex" xmlns:adec="http://schemas.microsoft.com/office/drawing/2017/decorative" val="1"/>
+                      <adec:decorative xmlns:adec="http://schemas.microsoft.com/office/drawing/2017/decorative" xmlns:w16se="http://schemas.microsoft.com/office/word/2015/wordml/symex" xmlns:w16cid="http://schemas.microsoft.com/office/word/2016/wordml/cid" xmlns:w="http://schemas.openxmlformats.org/wordprocessingml/2006/main" xmlns:w10="urn:schemas-microsoft-com:office:word" xmlns:v="urn:schemas-microsoft-com:vml" xmlns:o="urn:schemas-microsoft-com:office:office" xmlns:am3d="http://schemas.microsoft.com/office/drawing/2017/model3d" xmlns:aink="http://schemas.microsoft.com/office/drawing/2016/ink" xmlns:cx8="http://schemas.microsoft.com/office/drawing/2016/5/14/chartex" xmlns:cx7="http://schemas.microsoft.com/office/drawing/2016/5/13/chartex" xmlns:cx6="http://schemas.microsoft.com/office/drawing/2016/5/12/chartex" xmlns:cx5="http://schemas.microsoft.com/office/drawing/2016/5/11/chartex" xmlns:cx4="http://schemas.microsoft.com/office/drawing/2016/5/10/chartex" xmlns:cx3="http://schemas.microsoft.com/office/drawing/2016/5/9/chartex" xmlns:cx2="http://schemas.microsoft.com/office/drawing/2015/10/21/chartex" xmlns:cx1="http://schemas.microsoft.com/office/drawing/2015/9/8/chartex" xmlns:cx="http://schemas.microsoft.com/office/drawing/2014/chartex" xmlns="" val="1"/>
                     </a:ext>
                   </a:extLst>
                 </wp:docPr>
@@ -213,7 +213,7 @@
               </wp:anchor>
             </w:drawing>
           </mc:Choice>
-          <mc:Fallback xmlns:cx="http://schemas.microsoft.com/office/drawing/2014/chartex" xmlns:cx1="http://schemas.microsoft.com/office/drawing/2015/9/8/chartex" xmlns:cx2="http://schemas.microsoft.com/office/drawing/2015/10/21/chartex" xmlns:cx3="http://schemas.microsoft.com/office/drawing/2016/5/9/chartex" xmlns:cx4="http://schemas.microsoft.com/office/drawing/2016/5/10/chartex" xmlns:cx5="http://schemas.microsoft.com/office/drawing/2016/5/11/chartex" xmlns:cx6="http://schemas.microsoft.com/office/drawing/2016/5/12/chartex" xmlns:cx7="http://schemas.microsoft.com/office/drawing/2016/5/13/chartex" xmlns:cx8="http://schemas.microsoft.com/office/drawing/2016/5/14/chartex" xmlns:aink="http://schemas.microsoft.com/office/drawing/2016/ink" xmlns:am3d="http://schemas.microsoft.com/office/drawing/2017/model3d" xmlns:w16cid="http://schemas.microsoft.com/office/word/2016/wordml/cid" xmlns:w16se="http://schemas.microsoft.com/office/word/2015/wordml/symex" xmlns:w16cex="http://schemas.microsoft.com/office/word/2018/wordml/cex" xmlns:w16="http://schemas.microsoft.com/office/word/2018/wordml" xmlns:w16sdtdh="http://schemas.microsoft.com/office/word/2020/wordml/sdtdatahash">
+          <mc:Fallback xmlns:w16sdtdh="http://schemas.microsoft.com/office/word/2020/wordml/sdtdatahash" xmlns:w16="http://schemas.microsoft.com/office/word/2018/wordml" xmlns:w16cex="http://schemas.microsoft.com/office/word/2018/wordml/cex" xmlns:w16se="http://schemas.microsoft.com/office/word/2015/wordml/symex" xmlns:w16cid="http://schemas.microsoft.com/office/word/2016/wordml/cid" xmlns:am3d="http://schemas.microsoft.com/office/drawing/2017/model3d" xmlns:aink="http://schemas.microsoft.com/office/drawing/2016/ink" xmlns:cx8="http://schemas.microsoft.com/office/drawing/2016/5/14/chartex" xmlns:cx7="http://schemas.microsoft.com/office/drawing/2016/5/13/chartex" xmlns:cx6="http://schemas.microsoft.com/office/drawing/2016/5/12/chartex" xmlns:cx5="http://schemas.microsoft.com/office/drawing/2016/5/11/chartex" xmlns:cx4="http://schemas.microsoft.com/office/drawing/2016/5/10/chartex" xmlns:cx3="http://schemas.microsoft.com/office/drawing/2016/5/9/chartex" xmlns:cx2="http://schemas.microsoft.com/office/drawing/2015/10/21/chartex" xmlns:cx1="http://schemas.microsoft.com/office/drawing/2015/9/8/chartex" xmlns:cx="http://schemas.microsoft.com/office/drawing/2014/chartex">
             <w:pict>
               <v:rect w14:anchorId="5C6229C9" id="Rectángulo 4" o:spid="_x0000_s1026" style="position:absolute;margin-left:-55.7pt;margin-top:29pt;width:613.85pt;height:204pt;z-index:-251659776;visibility:visible;mso-wrap-style:square;mso-width-percent:0;mso-height-percent:0;mso-wrap-distance-left:9pt;mso-wrap-distance-top:0;mso-wrap-distance-right:9pt;mso-wrap-distance-bottom:0;mso-position-horizontal:absolute;mso-position-horizontal-relative:text;mso-position-vertical:absolute;mso-position-vertical-relative:text;mso-width-percent:0;mso-height-percent:0;mso-width-relative:page;mso-height-relative:margin;v-text-anchor:middle" o:gfxdata="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" fillcolor="#00314d" stroked="f" strokeweight="1pt"/>
             </w:pict>
@@ -252,7 +252,7 @@
                 <wp:docPr id="2" name="Cuadro de texto 2">
                   <a:extLst xmlns:a="http://schemas.openxmlformats.org/drawingml/2006/main">
                     <a:ext uri="{C183D7F6-B498-43B3-948B-1728B52AA6E4}">
-                      <adec:decorative xmlns="" xmlns:cx="http://schemas.microsoft.com/office/drawing/2014/chartex" xmlns:cx1="http://schemas.microsoft.com/office/drawing/2015/9/8/chartex" xmlns:cx2="http://schemas.microsoft.com/office/drawing/2015/10/21/chartex" xmlns:cx3="http://schemas.microsoft.com/office/drawing/2016/5/9/chartex" xmlns:cx4="http://schemas.microsoft.com/office/drawing/2016/5/10/chartex" xmlns:cx5="http://schemas.microsoft.com/office/drawing/2016/5/11/chartex" xmlns:cx6="http://schemas.microsoft.com/office/drawing/2016/5/12/chartex" xmlns:cx7="http://schemas.microsoft.com/office/drawing/2016/5/13/chartex" xmlns:cx8="http://schemas.microsoft.com/office/drawing/2016/5/14/chartex" xmlns:aink="http://schemas.microsoft.com/office/drawing/2016/ink" xmlns:am3d="http://schemas.microsoft.com/office/drawing/2017/model3d" xmlns:o="urn:schemas-microsoft-com:office:office" xmlns:v="urn:schemas-microsoft-com:vml" xmlns:w10="urn:schemas-microsoft-com:office:word" xmlns:w="http://schemas.openxmlformats.org/wordprocessingml/2006/main" xmlns:w16cid="http://schemas.microsoft.com/office/word/2016/wordml/cid" xmlns:w16se="http://schemas.microsoft.com/office/word/2015/wordml/symex" xmlns:adec="http://schemas.microsoft.com/office/drawing/2017/decorative" val="1"/>
+                      <adec:decorative xmlns:adec="http://schemas.microsoft.com/office/drawing/2017/decorative" xmlns:w16se="http://schemas.microsoft.com/office/word/2015/wordml/symex" xmlns:w16cid="http://schemas.microsoft.com/office/word/2016/wordml/cid" xmlns:w="http://schemas.openxmlformats.org/wordprocessingml/2006/main" xmlns:w10="urn:schemas-microsoft-com:office:word" xmlns:v="urn:schemas-microsoft-com:vml" xmlns:o="urn:schemas-microsoft-com:office:office" xmlns:am3d="http://schemas.microsoft.com/office/drawing/2017/model3d" xmlns:aink="http://schemas.microsoft.com/office/drawing/2016/ink" xmlns:cx8="http://schemas.microsoft.com/office/drawing/2016/5/14/chartex" xmlns:cx7="http://schemas.microsoft.com/office/drawing/2016/5/13/chartex" xmlns:cx6="http://schemas.microsoft.com/office/drawing/2016/5/12/chartex" xmlns:cx5="http://schemas.microsoft.com/office/drawing/2016/5/11/chartex" xmlns:cx4="http://schemas.microsoft.com/office/drawing/2016/5/10/chartex" xmlns:cx3="http://schemas.microsoft.com/office/drawing/2016/5/9/chartex" xmlns:cx2="http://schemas.microsoft.com/office/drawing/2015/10/21/chartex" xmlns:cx1="http://schemas.microsoft.com/office/drawing/2015/9/8/chartex" xmlns:cx="http://schemas.microsoft.com/office/drawing/2014/chartex" xmlns="" val="1"/>
                     </a:ext>
                   </a:extLst>
                 </wp:docPr>
@@ -519,7 +519,7 @@
         </w:rPr>
         <w:fldChar w:fldCharType="separate"/>
       </w:r>
-      <w:hyperlink w:anchor="_Toc223093756" w:history="1">
+      <w:hyperlink w:anchor="_Toc223942465" w:history="1">
         <w:r>
           <w:rPr>
             <w:rStyle w:val="Hipervnculo"/>
@@ -546,7 +546,7 @@
             <w:noProof/>
             <w:webHidden/>
           </w:rPr>
-          <w:instrText xml:space="preserve"> PAGEREF _Toc223093756 \h </w:instrText>
+          <w:instrText xml:space="preserve"> PAGEREF _Toc223942465 \h </w:instrText>
         </w:r>
         <w:r>
           <w:rPr>
@@ -592,7 +592,7 @@
           <w:lang w:eastAsia="es-CO"/>
         </w:rPr>
       </w:pPr>
-      <w:hyperlink w:anchor="_Toc223093757" w:history="1">
+      <w:hyperlink w:anchor="_Toc223942466" w:history="1">
         <w:r>
           <w:rPr>
             <w:rStyle w:val="Hipervnculo"/>
@@ -636,7 +636,7 @@
             <w:noProof/>
             <w:webHidden/>
           </w:rPr>
-          <w:instrText xml:space="preserve"> PAGEREF _Toc223093757 \h </w:instrText>
+          <w:instrText xml:space="preserve"> PAGEREF _Toc223942466 \h </w:instrText>
         </w:r>
         <w:r>
           <w:rPr>
@@ -656,7 +656,7 @@
             <w:noProof/>
             <w:webHidden/>
           </w:rPr>
-          <w:t>6</w:t>
+          <w:t>7</w:t>
         </w:r>
         <w:r>
           <w:rPr>
@@ -682,7 +682,7 @@
           <w:lang w:eastAsia="es-CO"/>
         </w:rPr>
       </w:pPr>
-      <w:hyperlink w:anchor="_Toc223093758" w:history="1">
+      <w:hyperlink w:anchor="_Toc223942467" w:history="1">
         <w:r>
           <w:rPr>
             <w:rStyle w:val="Hipervnculo"/>
@@ -726,7 +726,7 @@
             <w:noProof/>
             <w:webHidden/>
           </w:rPr>
-          <w:instrText xml:space="preserve"> PAGEREF _Toc223093758 \h </w:instrText>
+          <w:instrText xml:space="preserve"> PAGEREF _Toc223942467 \h </w:instrText>
         </w:r>
         <w:r>
           <w:rPr>
@@ -746,7 +746,7 @@
             <w:noProof/>
             <w:webHidden/>
           </w:rPr>
-          <w:t>9</w:t>
+          <w:t>10</w:t>
         </w:r>
         <w:r>
           <w:rPr>
@@ -772,7 +772,7 @@
           <w:lang w:eastAsia="es-CO"/>
         </w:rPr>
       </w:pPr>
-      <w:hyperlink w:anchor="_Toc223093759" w:history="1">
+      <w:hyperlink w:anchor="_Toc223942468" w:history="1">
         <w:r>
           <w:rPr>
             <w:rStyle w:val="Hipervnculo"/>
@@ -816,7 +816,7 @@
             <w:noProof/>
             <w:webHidden/>
           </w:rPr>
-          <w:instrText xml:space="preserve"> PAGEREF _Toc223093759 \h </w:instrText>
+          <w:instrText xml:space="preserve"> PAGEREF _Toc223942468 \h </w:instrText>
         </w:r>
         <w:r>
           <w:rPr>
@@ -836,7 +836,7 @@
             <w:noProof/>
             <w:webHidden/>
           </w:rPr>
-          <w:t>10</w:t>
+          <w:t>11</w:t>
         </w:r>
         <w:r>
           <w:rPr>
@@ -862,7 +862,7 @@
           <w:lang w:eastAsia="es-CO"/>
         </w:rPr>
       </w:pPr>
-      <w:hyperlink w:anchor="_Toc223093760" w:history="1">
+      <w:hyperlink w:anchor="_Toc223942469" w:history="1">
         <w:r>
           <w:rPr>
             <w:rStyle w:val="Hipervnculo"/>
@@ -906,7 +906,7 @@
             <w:noProof/>
             <w:webHidden/>
           </w:rPr>
-          <w:instrText xml:space="preserve"> PAGEREF _Toc223093760 \h </w:instrText>
+          <w:instrText xml:space="preserve"> PAGEREF _Toc223942469 \h </w:instrText>
         </w:r>
         <w:r>
           <w:rPr>
@@ -926,7 +926,7 @@
             <w:noProof/>
             <w:webHidden/>
           </w:rPr>
-          <w:t>12</w:t>
+          <w:t>13</w:t>
         </w:r>
         <w:r>
           <w:rPr>
@@ -952,7 +952,7 @@
           <w:lang w:eastAsia="es-CO"/>
         </w:rPr>
       </w:pPr>
-      <w:hyperlink w:anchor="_Toc223093761" w:history="1">
+      <w:hyperlink w:anchor="_Toc223942470" w:history="1">
         <w:r>
           <w:rPr>
             <w:rStyle w:val="Hipervnculo"/>
@@ -996,7 +996,7 @@
             <w:noProof/>
             <w:webHidden/>
           </w:rPr>
-          <w:instrText xml:space="preserve"> PAGEREF _Toc223093761 \h </w:instrText>
+          <w:instrText xml:space="preserve"> PAGEREF _Toc223942470 \h </w:instrText>
         </w:r>
         <w:r>
           <w:rPr>
@@ -1042,7 +1042,7 @@
           <w:lang w:eastAsia="es-CO"/>
         </w:rPr>
       </w:pPr>
-      <w:hyperlink w:anchor="_Toc223093762" w:history="1">
+      <w:hyperlink w:anchor="_Toc223942471" w:history="1">
         <w:r>
           <w:rPr>
             <w:rStyle w:val="Hipervnculo"/>
@@ -1086,7 +1086,7 @@
             <w:noProof/>
             <w:webHidden/>
           </w:rPr>
-          <w:instrText xml:space="preserve"> PAGEREF _Toc223093762 \h </w:instrText>
+          <w:instrText xml:space="preserve"> PAGEREF _Toc223942471 \h </w:instrText>
         </w:r>
         <w:r>
           <w:rPr>
@@ -1132,7 +1132,7 @@
           <w:lang w:eastAsia="es-CO"/>
         </w:rPr>
       </w:pPr>
-      <w:hyperlink w:anchor="_Toc223093763" w:history="1">
+      <w:hyperlink w:anchor="_Toc223942472" w:history="1">
         <w:r>
           <w:rPr>
             <w:rStyle w:val="Hipervnculo"/>
@@ -1176,7 +1176,7 @@
             <w:noProof/>
             <w:webHidden/>
           </w:rPr>
-          <w:instrText xml:space="preserve"> PAGEREF _Toc223093763 \h </w:instrText>
+          <w:instrText xml:space="preserve"> PAGEREF _Toc223942472 \h </w:instrText>
         </w:r>
         <w:r>
           <w:rPr>
@@ -1222,7 +1222,7 @@
           <w:lang w:eastAsia="es-CO"/>
         </w:rPr>
       </w:pPr>
-      <w:hyperlink w:anchor="_Toc223093764" w:history="1">
+      <w:hyperlink w:anchor="_Toc223942473" w:history="1">
         <w:r>
           <w:rPr>
             <w:rStyle w:val="Hipervnculo"/>
@@ -1266,7 +1266,7 @@
             <w:noProof/>
             <w:webHidden/>
           </w:rPr>
-          <w:instrText xml:space="preserve"> PAGEREF _Toc223093764 \h </w:instrText>
+          <w:instrText xml:space="preserve"> PAGEREF _Toc223942473 \h </w:instrText>
         </w:r>
         <w:r>
           <w:rPr>
@@ -1312,7 +1312,7 @@
           <w:lang w:eastAsia="es-CO"/>
         </w:rPr>
       </w:pPr>
-      <w:hyperlink w:anchor="_Toc223093765" w:history="1">
+      <w:hyperlink w:anchor="_Toc223942474" w:history="1">
         <w:r>
           <w:rPr>
             <w:rStyle w:val="Hipervnculo"/>
@@ -1356,7 +1356,7 @@
             <w:noProof/>
             <w:webHidden/>
           </w:rPr>
-          <w:instrText xml:space="preserve"> PAGEREF _Toc223093765 \h </w:instrText>
+          <w:instrText xml:space="preserve"> PAGEREF _Toc223942474 \h </w:instrText>
         </w:r>
         <w:r>
           <w:rPr>
@@ -1402,7 +1402,7 @@
           <w:lang w:eastAsia="es-CO"/>
         </w:rPr>
       </w:pPr>
-      <w:hyperlink w:anchor="_Toc223093766" w:history="1">
+      <w:hyperlink w:anchor="_Toc223942475" w:history="1">
         <w:r>
           <w:rPr>
             <w:rStyle w:val="Hipervnculo"/>
@@ -1446,7 +1446,7 @@
             <w:noProof/>
             <w:webHidden/>
           </w:rPr>
-          <w:instrText xml:space="preserve"> PAGEREF _Toc223093766 \h </w:instrText>
+          <w:instrText xml:space="preserve"> PAGEREF _Toc223942475 \h </w:instrText>
         </w:r>
         <w:r>
           <w:rPr>
@@ -1492,7 +1492,7 @@
           <w:lang w:eastAsia="es-CO"/>
         </w:rPr>
       </w:pPr>
-      <w:hyperlink w:anchor="_Toc223093767" w:history="1">
+      <w:hyperlink w:anchor="_Toc223942476" w:history="1">
         <w:r>
           <w:rPr>
             <w:rStyle w:val="Hipervnculo"/>
@@ -1536,7 +1536,7 @@
             <w:noProof/>
             <w:webHidden/>
           </w:rPr>
-          <w:instrText xml:space="preserve"> PAGEREF _Toc223093767 \h </w:instrText>
+          <w:instrText xml:space="preserve"> PAGEREF _Toc223942476 \h </w:instrText>
         </w:r>
         <w:r>
           <w:rPr>
@@ -1582,7 +1582,7 @@
           <w:lang w:eastAsia="es-CO"/>
         </w:rPr>
       </w:pPr>
-      <w:hyperlink w:anchor="_Toc223093768" w:history="1">
+      <w:hyperlink w:anchor="_Toc223942477" w:history="1">
         <w:r>
           <w:rPr>
             <w:rStyle w:val="Hipervnculo"/>
@@ -1626,7 +1626,7 @@
             <w:noProof/>
             <w:webHidden/>
           </w:rPr>
-          <w:instrText xml:space="preserve"> PAGEREF _Toc223093768 \h </w:instrText>
+          <w:instrText xml:space="preserve"> PAGEREF _Toc223942477 \h </w:instrText>
         </w:r>
         <w:r>
           <w:rPr>
@@ -1672,7 +1672,7 @@
           <w:lang w:eastAsia="es-CO"/>
         </w:rPr>
       </w:pPr>
-      <w:hyperlink w:anchor="_Toc223093769" w:history="1">
+      <w:hyperlink w:anchor="_Toc223942478" w:history="1">
         <w:r>
           <w:rPr>
             <w:rStyle w:val="Hipervnculo"/>
@@ -1716,7 +1716,7 @@
             <w:noProof/>
             <w:webHidden/>
           </w:rPr>
-          <w:instrText xml:space="preserve"> PAGEREF _Toc223093769 \h </w:instrText>
+          <w:instrText xml:space="preserve"> PAGEREF _Toc223942478 \h </w:instrText>
         </w:r>
         <w:r>
           <w:rPr>
@@ -1762,7 +1762,7 @@
           <w:lang w:eastAsia="es-CO"/>
         </w:rPr>
       </w:pPr>
-      <w:hyperlink w:anchor="_Toc223093770" w:history="1">
+      <w:hyperlink w:anchor="_Toc223942479" w:history="1">
         <w:r>
           <w:rPr>
             <w:rStyle w:val="Hipervnculo"/>
@@ -1806,7 +1806,7 @@
             <w:noProof/>
             <w:webHidden/>
           </w:rPr>
-          <w:instrText xml:space="preserve"> PAGEREF _Toc223093770 \h </w:instrText>
+          <w:instrText xml:space="preserve"> PAGEREF _Toc223942479 \h </w:instrText>
         </w:r>
         <w:r>
           <w:rPr>
@@ -1851,7 +1851,7 @@
           <w:lang w:eastAsia="es-CO"/>
         </w:rPr>
       </w:pPr>
-      <w:hyperlink w:anchor="_Toc223093771" w:history="1">
+      <w:hyperlink w:anchor="_Toc223942480" w:history="1">
         <w:r>
           <w:rPr>
             <w:rStyle w:val="Hipervnculo"/>
@@ -1878,7 +1878,7 @@
             <w:noProof/>
             <w:webHidden/>
           </w:rPr>
-          <w:instrText xml:space="preserve"> PAGEREF _Toc223093771 \h </w:instrText>
+          <w:instrText xml:space="preserve"> PAGEREF _Toc223942480 \h </w:instrText>
         </w:r>
         <w:r>
           <w:rPr>
@@ -1923,7 +1923,7 @@
           <w:lang w:eastAsia="es-CO"/>
         </w:rPr>
       </w:pPr>
-      <w:hyperlink w:anchor="_Toc223093772" w:history="1">
+      <w:hyperlink w:anchor="_Toc223942481" w:history="1">
         <w:r>
           <w:rPr>
             <w:rStyle w:val="Hipervnculo"/>
@@ -1950,7 +1950,7 @@
             <w:noProof/>
             <w:webHidden/>
           </w:rPr>
-          <w:instrText xml:space="preserve"> PAGEREF _Toc223093772 \h </w:instrText>
+          <w:instrText xml:space="preserve"> PAGEREF _Toc223942481 \h </w:instrText>
         </w:r>
         <w:r>
           <w:rPr>
@@ -1995,7 +1995,7 @@
           <w:lang w:eastAsia="es-CO"/>
         </w:rPr>
       </w:pPr>
-      <w:hyperlink w:anchor="_Toc223093773" w:history="1">
+      <w:hyperlink w:anchor="_Toc223942482" w:history="1">
         <w:r>
           <w:rPr>
             <w:rStyle w:val="Hipervnculo"/>
@@ -2023,7 +2023,7 @@
             <w:noProof/>
             <w:webHidden/>
           </w:rPr>
-          <w:instrText xml:space="preserve"> PAGEREF _Toc223093773 \h </w:instrText>
+          <w:instrText xml:space="preserve"> PAGEREF _Toc223942482 \h </w:instrText>
         </w:r>
         <w:r>
           <w:rPr>
@@ -2068,7 +2068,7 @@
           <w:lang w:eastAsia="es-CO"/>
         </w:rPr>
       </w:pPr>
-      <w:hyperlink w:anchor="_Toc223093774" w:history="1">
+      <w:hyperlink w:anchor="_Toc223942483" w:history="1">
         <w:r>
           <w:rPr>
             <w:rStyle w:val="Hipervnculo"/>
@@ -2095,7 +2095,7 @@
             <w:noProof/>
             <w:webHidden/>
           </w:rPr>
-          <w:instrText xml:space="preserve"> PAGEREF _Toc223093774 \h </w:instrText>
+          <w:instrText xml:space="preserve"> PAGEREF _Toc223942483 \h </w:instrText>
         </w:r>
         <w:r>
           <w:rPr>
@@ -2138,7 +2138,7 @@
         <w:fldChar w:fldCharType="end"/>
       </w:r>
       <w:bookmarkStart w:id="0" w:name="_Toc176443691"/>
-      <w:bookmarkStart w:id="1" w:name="_Toc223093756"/>
+      <w:bookmarkStart w:id="1" w:name="_Toc223942465"/>
       <w:r>
         <w:t>Introducción</w:t>
       </w:r>
@@ -2371,13 +2371,569 @@
           </w:p>
         </w:tc>
       </w:tr>
-      <w:bookmarkEnd w:id="2"/>
     </w:tbl>
+    <w:bookmarkEnd w:id="2"/>
     <w:p>
       <w:pPr>
         <w:spacing w:before="0" w:after="0"/>
         <w:ind w:firstLine="0"/>
       </w:pPr>
+      <w:r>
+        <w:lastRenderedPageBreak/>
+        <w:tab/>
+      </w:r>
+      <w:r>
+        <w:tab/>
+      </w:r>
+      <w:r>
+        <w:tab/>
+      </w:r>
+      <w:r>
+        <w:tab/>
+      </w:r>
+      <w:r>
+        <w:tab/>
+      </w:r>
+      <w:r>
+        <w:tab/>
+      </w:r>
+      <w:r>
+        <w:tab/>
+      </w:r>
+      <w:r>
+        <w:tab/>
+      </w:r>
+      <w:r>
+        <w:tab/>
+      </w:r>
+      <w:r>
+        <w:tab/>
+      </w:r>
+      <w:r>
+        <w:tab/>
+      </w:r>
+      <w:r>
+        <w:tab/>
+      </w:r>
+      <w:r>
+        <w:tab/>
+      </w:r>
+      <w:r>
+        <w:tab/>
+      </w:r>
+      <w:r>
+        <w:tab/>
+      </w:r>
+      <w:r>
+        <w:tab/>
+      </w:r>
+      <w:r>
+        <w:tab/>
+      </w:r>
+      <w:r>
+        <w:tab/>
+      </w:r>
+      <w:r>
+        <w:tab/>
+      </w:r>
+      <w:r>
+        <w:tab/>
+      </w:r>
+      <w:r>
+        <w:tab/>
+      </w:r>
+      <w:r>
+        <w:tab/>
+      </w:r>
+      <w:r>
+        <w:tab/>
+      </w:r>
+      <w:r>
+        <w:tab/>
+      </w:r>
+      <w:r>
+        <w:tab/>
+      </w:r>
+      <w:r>
+        <w:tab/>
+      </w:r>
+      <w:r>
+        <w:tab/>
+      </w:r>
+      <w:r>
+        <w:tab/>
+      </w:r>
+      <w:r>
+        <w:tab/>
+      </w:r>
+      <w:r>
+        <w:tab/>
+      </w:r>
+      <w:r>
+        <w:tab/>
+      </w:r>
+      <w:r>
+        <w:tab/>
+      </w:r>
+      <w:r>
+        <w:tab/>
+      </w:r>
+      <w:r>
+        <w:tab/>
+      </w:r>
+      <w:r>
+        <w:tab/>
+      </w:r>
+      <w:r>
+        <w:tab/>
+      </w:r>
+      <w:r>
+        <w:tab/>
+      </w:r>
+      <w:r>
+        <w:tab/>
+      </w:r>
+      <w:r>
+        <w:tab/>
+      </w:r>
+      <w:r>
+        <w:tab/>
+      </w:r>
+      <w:r>
+        <w:tab/>
+      </w:r>
+      <w:r>
+        <w:tab/>
+      </w:r>
+      <w:r>
+        <w:tab/>
+      </w:r>
+      <w:r>
+        <w:tab/>
+      </w:r>
+      <w:r>
+        <w:tab/>
+      </w:r>
+      <w:r>
+        <w:tab/>
+      </w:r>
+      <w:r>
+        <w:tab/>
+      </w:r>
+      <w:r>
+        <w:tab/>
+      </w:r>
+      <w:r>
+        <w:tab/>
+      </w:r>
+      <w:r>
+        <w:tab/>
+      </w:r>
+      <w:r>
+        <w:tab/>
+      </w:r>
+      <w:r>
+        <w:tab/>
+      </w:r>
+      <w:r>
+        <w:tab/>
+      </w:r>
+      <w:r>
+        <w:tab/>
+      </w:r>
+      <w:r>
+        <w:tab/>
+      </w:r>
+      <w:r>
+        <w:tab/>
+      </w:r>
+      <w:r>
+        <w:tab/>
+      </w:r>
+      <w:r>
+        <w:tab/>
+      </w:r>
+      <w:r>
+        <w:tab/>
+      </w:r>
+      <w:r>
+        <w:tab/>
+      </w:r>
+      <w:r>
+        <w:tab/>
+      </w:r>
+      <w:r>
+        <w:tab/>
+      </w:r>
+      <w:r>
+        <w:tab/>
+      </w:r>
+      <w:r>
+        <w:tab/>
+      </w:r>
+      <w:r>
+        <w:tab/>
+      </w:r>
+      <w:r>
+        <w:tab/>
+      </w:r>
+      <w:r>
+        <w:tab/>
+      </w:r>
+      <w:r>
+        <w:tab/>
+      </w:r>
+      <w:r>
+        <w:tab/>
+      </w:r>
+      <w:r>
+        <w:tab/>
+      </w:r>
+      <w:r>
+        <w:tab/>
+      </w:r>
+      <w:r>
+        <w:tab/>
+      </w:r>
+      <w:r>
+        <w:tab/>
+      </w:r>
+      <w:r>
+        <w:tab/>
+      </w:r>
+      <w:r>
+        <w:tab/>
+      </w:r>
+      <w:r>
+        <w:tab/>
+      </w:r>
+      <w:r>
+        <w:tab/>
+      </w:r>
+      <w:r>
+        <w:tab/>
+      </w:r>
+      <w:r>
+        <w:tab/>
+      </w:r>
+      <w:r>
+        <w:tab/>
+      </w:r>
+      <w:r>
+        <w:tab/>
+      </w:r>
+      <w:r>
+        <w:tab/>
+      </w:r>
+      <w:r>
+        <w:tab/>
+      </w:r>
+      <w:r>
+        <w:tab/>
+      </w:r>
+      <w:r>
+        <w:tab/>
+      </w:r>
+      <w:r>
+        <w:tab/>
+      </w:r>
+      <w:r>
+        <w:tab/>
+      </w:r>
+      <w:r>
+        <w:tab/>
+      </w:r>
+      <w:r>
+        <w:tab/>
+      </w:r>
+      <w:r>
+        <w:tab/>
+      </w:r>
+      <w:r>
+        <w:tab/>
+      </w:r>
+      <w:r>
+        <w:tab/>
+      </w:r>
+      <w:r>
+        <w:tab/>
+      </w:r>
+      <w:r>
+        <w:tab/>
+      </w:r>
+      <w:r>
+        <w:tab/>
+      </w:r>
+      <w:r>
+        <w:tab/>
+      </w:r>
+      <w:r>
+        <w:tab/>
+      </w:r>
+      <w:r>
+        <w:tab/>
+      </w:r>
+      <w:r>
+        <w:tab/>
+      </w:r>
+      <w:r>
+        <w:tab/>
+      </w:r>
+      <w:r>
+        <w:tab/>
+      </w:r>
+      <w:r>
+        <w:tab/>
+      </w:r>
+      <w:r>
+        <w:tab/>
+      </w:r>
+      <w:r>
+        <w:tab/>
+      </w:r>
+      <w:r>
+        <w:tab/>
+      </w:r>
+      <w:r>
+        <w:tab/>
+      </w:r>
+      <w:r>
+        <w:tab/>
+      </w:r>
+      <w:r>
+        <w:tab/>
+      </w:r>
+      <w:r>
+        <w:tab/>
+      </w:r>
+      <w:r>
+        <w:tab/>
+      </w:r>
+      <w:r>
+        <w:tab/>
+      </w:r>
+      <w:r>
+        <w:tab/>
+      </w:r>
+      <w:r>
+        <w:tab/>
+      </w:r>
+      <w:r>
+        <w:tab/>
+      </w:r>
+      <w:r>
+        <w:tab/>
+      </w:r>
+      <w:r>
+        <w:tab/>
+      </w:r>
+      <w:r>
+        <w:tab/>
+      </w:r>
+      <w:r>
+        <w:tab/>
+      </w:r>
+      <w:r>
+        <w:tab/>
+      </w:r>
+      <w:r>
+        <w:tab/>
+      </w:r>
+      <w:r>
+        <w:tab/>
+      </w:r>
+      <w:r>
+        <w:tab/>
+      </w:r>
+      <w:r>
+        <w:tab/>
+      </w:r>
+      <w:r>
+        <w:tab/>
+      </w:r>
+      <w:r>
+        <w:tab/>
+      </w:r>
+      <w:r>
+        <w:tab/>
+      </w:r>
+      <w:r>
+        <w:tab/>
+      </w:r>
+      <w:r>
+        <w:tab/>
+      </w:r>
+      <w:r>
+        <w:tab/>
+      </w:r>
+      <w:r>
+        <w:tab/>
+      </w:r>
+      <w:r>
+        <w:tab/>
+      </w:r>
+      <w:r>
+        <w:tab/>
+      </w:r>
+      <w:r>
+        <w:tab/>
+      </w:r>
+      <w:r>
+        <w:tab/>
+      </w:r>
+      <w:r>
+        <w:tab/>
+      </w:r>
+      <w:r>
+        <w:tab/>
+      </w:r>
+      <w:r>
+        <w:tab/>
+      </w:r>
+      <w:r>
+        <w:tab/>
+      </w:r>
+      <w:r>
+        <w:tab/>
+      </w:r>
+      <w:r>
+        <w:tab/>
+      </w:r>
+      <w:r>
+        <w:tab/>
+      </w:r>
+      <w:r>
+        <w:tab/>
+      </w:r>
+      <w:r>
+        <w:tab/>
+      </w:r>
+      <w:r>
+        <w:tab/>
+      </w:r>
+      <w:r>
+        <w:tab/>
+      </w:r>
+      <w:r>
+        <w:tab/>
+      </w:r>
+      <w:r>
+        <w:tab/>
+      </w:r>
+      <w:r>
+        <w:tab/>
+      </w:r>
+      <w:r>
+        <w:tab/>
+      </w:r>
+      <w:r>
+        <w:tab/>
+      </w:r>
+      <w:r>
+        <w:tab/>
+      </w:r>
+      <w:r>
+        <w:tab/>
+      </w:r>
+      <w:r>
+        <w:tab/>
+      </w:r>
+      <w:r>
+        <w:tab/>
+      </w:r>
+      <w:r>
+        <w:tab/>
+      </w:r>
+      <w:r>
+        <w:tab/>
+      </w:r>
+      <w:r>
+        <w:tab/>
+      </w:r>
+      <w:r>
+        <w:tab/>
+      </w:r>
+      <w:r>
+        <w:tab/>
+      </w:r>
+      <w:r>
+        <w:tab/>
+      </w:r>
+      <w:r>
+        <w:tab/>
+      </w:r>
+      <w:r>
+        <w:tab/>
+      </w:r>
+      <w:r>
+        <w:tab/>
+      </w:r>
+      <w:r>
+        <w:tab/>
+      </w:r>
+      <w:r>
+        <w:tab/>
+      </w:r>
+      <w:r>
+        <w:tab/>
+      </w:r>
+      <w:r>
+        <w:tab/>
+      </w:r>
+      <w:r>
+        <w:tab/>
+      </w:r>
+      <w:r>
+        <w:tab/>
+      </w:r>
+      <w:r>
+        <w:tab/>
+      </w:r>
+      <w:r>
+        <w:tab/>
+      </w:r>
+      <w:r>
+        <w:tab/>
+      </w:r>
+      <w:r>
+        <w:tab/>
+      </w:r>
+      <w:r>
+        <w:tab/>
+      </w:r>
+      <w:r>
+        <w:tab/>
+      </w:r>
+      <w:r>
+        <w:tab/>
+      </w:r>
+      <w:r>
+        <w:tab/>
+      </w:r>
+      <w:r>
+        <w:tab/>
+      </w:r>
+      <w:r>
+        <w:tab/>
+      </w:r>
+      <w:r>
+        <w:tab/>
+      </w:r>
+      <w:r>
+        <w:tab/>
+      </w:r>
+      <w:r>
+        <w:tab/>
+      </w:r>
+      <w:r>
+        <w:tab/>
+      </w:r>
+      <w:r>
+        <w:tab/>
+      </w:r>
+      <w:r>
+        <w:tab/>
+      </w:r>
     </w:p>
     <w:p>
       <w:pPr>
@@ -2392,8 +2948,9 @@
         <w:spacing w:after="120"/>
         <w:ind w:left="720"/>
       </w:pPr>
-      <w:bookmarkStart w:id="3" w:name="_Toc223093757"/>
-      <w:r>
+      <w:bookmarkStart w:id="3" w:name="_Toc223942466"/>
+      <w:r>
+        <w:lastRenderedPageBreak/>
         <w:t>Trabajo colaborativo en entornos digitales</w:t>
       </w:r>
       <w:bookmarkEnd w:id="3"/>
@@ -2421,40 +2978,94 @@
         <w:rPr>
           <w:lang w:eastAsia="es-CO"/>
         </w:rPr>
-        <w:t xml:space="preserve">El trabajo colaborativo representa una estrategia de gestión que integra personas, procesos y tecnologías que permiten a las organizaciones alcanzar objetivos en forma eficiente. Esta modalidad de trabajo se fundamenta en la cooperación activa entre equipos de una misma área o departamento, así como entre equipos multidisciplinarios, donde cada miembro aporta sus conocimientos y habilidades a </w:t>
-      </w:r>
+        <w:t>El trabajo colaborativo representa una estrategia de gestión que integra personas, procesos y tecnologías que permiten a las organizaciones alcanzar objetivos en forma eficiente. Esta modalidad de trabajo se fundamenta en la cooperación activa entre equipos de una misma área o departamento, así como entre equipos multidisciplinarios, donde cada miembro aporta sus conocimientos y habilidades a través de herramientas digitales que facilitan la comunicación, la planificación, la ejecución y el seguimiento de las tareas definidas y en desarrollo. Se puede decir que esta modalidad, gracias a los avances tecnológicos, promueve la sinergia organizacional, optimiza los recursos y fomenta una cultura de innovación orientada a resultados.</w:t>
+      </w:r>
+    </w:p>
+    <w:p>
+      <w:pPr>
+        <w:rPr>
+          <w:lang w:eastAsia="es-CO"/>
+        </w:rPr>
+      </w:pPr>
+      <w:r>
+        <w:rPr>
+          <w:lang w:eastAsia="es-CO"/>
+        </w:rPr>
+        <w:t>A continuación, se presenta una tabla en donde por medio de ejemplos se muestran diferentes formas y herramientas digitales que permiten a las organizaciones aprovechar el trabajo colaborativo. Cada ejemplo ilustra la aplicación práctica de la colaboración en línea en distintos contextos empresariales, promoviendo la productividad y la innovación conjunta:</w:t>
+      </w:r>
+      <w:r>
+        <w:rPr>
+          <w:lang w:eastAsia="es-CO"/>
+        </w:rPr>
+        <w:tab/>
+      </w:r>
+      <w:r>
+        <w:rPr>
+          <w:lang w:eastAsia="es-CO"/>
+        </w:rPr>
+        <w:tab/>
+      </w:r>
+      <w:r>
+        <w:rPr>
+          <w:lang w:eastAsia="es-CO"/>
+        </w:rPr>
+        <w:tab/>
+      </w:r>
+      <w:r>
+        <w:rPr>
+          <w:lang w:eastAsia="es-CO"/>
+        </w:rPr>
+        <w:tab/>
+      </w:r>
+      <w:r>
+        <w:rPr>
+          <w:lang w:eastAsia="es-CO"/>
+        </w:rPr>
+        <w:tab/>
+      </w:r>
+      <w:r>
+        <w:rPr>
+          <w:lang w:eastAsia="es-CO"/>
+        </w:rPr>
+        <w:tab/>
+      </w:r>
+      <w:r>
+        <w:rPr>
+          <w:lang w:eastAsia="es-CO"/>
+        </w:rPr>
+        <w:tab/>
+      </w:r>
+      <w:r>
+        <w:rPr>
+          <w:lang w:eastAsia="es-CO"/>
+        </w:rPr>
+        <w:tab/>
+      </w:r>
+      <w:r>
+        <w:rPr>
+          <w:lang w:eastAsia="es-CO"/>
+        </w:rPr>
+        <w:tab/>
+      </w:r>
+      <w:r>
+        <w:rPr>
+          <w:lang w:eastAsia="es-CO"/>
+        </w:rPr>
+        <w:tab/>
+      </w:r>
+    </w:p>
+    <w:p>
+      <w:pPr>
+        <w:pStyle w:val="Tabla"/>
+        <w:rPr>
+          <w:lang w:eastAsia="es-CO"/>
+        </w:rPr>
+      </w:pPr>
       <w:r>
         <w:rPr>
           <w:lang w:eastAsia="es-CO"/>
         </w:rPr>
         <w:lastRenderedPageBreak/>
-        <w:t>través de herramientas digitales que facilitan la comunicación, la planificación, la ejecución y el seguimiento de las tareas definidas y en desarrollo. Se puede decir que esta modalidad, gracias a los avances tecnológicos, promueve la sinergia organizacional, optimiza los recursos y fomenta una cultura de innovación orientada a resultados.</w:t>
-      </w:r>
-    </w:p>
-    <w:p>
-      <w:pPr>
-        <w:rPr>
-          <w:lang w:eastAsia="es-CO"/>
-        </w:rPr>
-      </w:pPr>
-      <w:r>
-        <w:rPr>
-          <w:lang w:eastAsia="es-CO"/>
-        </w:rPr>
-        <w:t>A continuación, se presenta una tabla en donde por medio de ejemplos se muestran diferentes formas y herramientas digitales que permiten a las organizaciones aprovechar el trabajo colaborativo. Cada ejemplo ilustra la aplicación práctica de la colaboración en línea en distintos contextos empresariales, promoviendo la productividad y la innovación conjunta:</w:t>
-      </w:r>
-    </w:p>
-    <w:p>
-      <w:pPr>
-        <w:pStyle w:val="Tabla"/>
-        <w:rPr>
-          <w:lang w:eastAsia="es-CO"/>
-        </w:rPr>
-      </w:pPr>
-      <w:r>
-        <w:rPr>
-          <w:lang w:eastAsia="es-CO"/>
-        </w:rPr>
         <w:t>Ejemplos de uso de herramientas digitales para el trabajo colaborativo</w:t>
       </w:r>
     </w:p>
@@ -2638,11 +3249,7 @@
               </w:rPr>
             </w:pPr>
             <w:r>
-              <w:t xml:space="preserve">Almacenamiento y gestión de documentos institucionales en </w:t>
-            </w:r>
-            <w:r>
-              <w:lastRenderedPageBreak/>
-              <w:t>espacios compartidos.</w:t>
+              <w:t>Almacenamiento y gestión de documentos institucionales en espacios compartidos.</w:t>
             </w:r>
           </w:p>
         </w:tc>
@@ -2658,7 +3265,6 @@
               </w:rPr>
             </w:pPr>
             <w:r>
-              <w:lastRenderedPageBreak/>
               <w:t>Colaboración documental y control de versiones.</w:t>
             </w:r>
           </w:p>
@@ -2675,11 +3281,7 @@
               </w:rPr>
             </w:pPr>
             <w:r>
-              <w:t xml:space="preserve">Facilita el acceso a la información y garantiza </w:t>
-            </w:r>
-            <w:r>
-              <w:lastRenderedPageBreak/>
-              <w:t>trazabilidad de cambios.</w:t>
+              <w:t>Facilita el acceso a la información y garantiza trazabilidad de cambios.</w:t>
             </w:r>
           </w:p>
         </w:tc>
@@ -2700,7 +3302,6 @@
               </w:rPr>
             </w:pPr>
             <w:r>
-              <w:lastRenderedPageBreak/>
               <w:t>Planner</w:t>
             </w:r>
           </w:p>
@@ -2783,7 +3384,11 @@
               </w:rPr>
             </w:pPr>
             <w:r>
-              <w:t>Intercambio seguro de archivos personales o departamentales.</w:t>
+              <w:t xml:space="preserve">Intercambio seguro de archivos </w:t>
+            </w:r>
+            <w:r>
+              <w:lastRenderedPageBreak/>
+              <w:t>personales o departamentales.</w:t>
             </w:r>
           </w:p>
         </w:tc>
@@ -2799,6 +3404,7 @@
               </w:rPr>
             </w:pPr>
             <w:r>
+              <w:lastRenderedPageBreak/>
               <w:t>Colaboración individual y por pares.</w:t>
             </w:r>
           </w:p>
@@ -2815,7 +3421,11 @@
               </w:rPr>
             </w:pPr>
             <w:r>
-              <w:t>Permite acceso remoto y evita pérdida de información.</w:t>
+              <w:t xml:space="preserve">Permite acceso remoto y evita </w:t>
+            </w:r>
+            <w:r>
+              <w:lastRenderedPageBreak/>
+              <w:t>pérdida de información.</w:t>
             </w:r>
           </w:p>
         </w:tc>
@@ -2836,6 +3446,7 @@
               </w:rPr>
             </w:pPr>
             <w:r>
+              <w:lastRenderedPageBreak/>
               <w:t xml:space="preserve">Google </w:t>
             </w:r>
             <w:proofErr w:type="spellStart"/>
@@ -2925,11 +3536,7 @@
               </w:rPr>
             </w:pPr>
             <w:r>
-              <w:t xml:space="preserve">Planificación de proyectos y seguimiento de </w:t>
-            </w:r>
-            <w:r>
-              <w:lastRenderedPageBreak/>
-              <w:t>actividades por fases.</w:t>
+              <w:t>Planificación de proyectos y seguimiento de actividades por fases.</w:t>
             </w:r>
           </w:p>
         </w:tc>
@@ -2945,7 +3552,6 @@
               </w:rPr>
             </w:pPr>
             <w:r>
-              <w:lastRenderedPageBreak/>
               <w:t>Colaboración visual mediante tableros.</w:t>
             </w:r>
           </w:p>
@@ -2962,11 +3568,7 @@
               </w:rPr>
             </w:pPr>
             <w:r>
-              <w:t xml:space="preserve">Favorece la organización de procesos y la </w:t>
-            </w:r>
-            <w:r>
-              <w:lastRenderedPageBreak/>
-              <w:t>priorización de tareas.</w:t>
+              <w:t>Favorece la organización de procesos y la priorización de tareas.</w:t>
             </w:r>
           </w:p>
         </w:tc>
@@ -2987,7 +3589,6 @@
               </w:rPr>
             </w:pPr>
             <w:r>
-              <w:lastRenderedPageBreak/>
               <w:t xml:space="preserve">Zoom </w:t>
             </w:r>
           </w:p>
@@ -3055,8 +3656,9 @@
       <w:pPr>
         <w:pStyle w:val="Ttulo2"/>
       </w:pPr>
-      <w:bookmarkStart w:id="4" w:name="_Toc223093758"/>
-      <w:r>
+      <w:bookmarkStart w:id="4" w:name="_Toc223942467"/>
+      <w:r>
+        <w:lastRenderedPageBreak/>
         <w:t>Beneficios</w:t>
       </w:r>
       <w:bookmarkEnd w:id="4"/>
@@ -3178,7 +3780,6 @@
           <w:b/>
           <w:lang w:eastAsia="es-CO"/>
         </w:rPr>
-        <w:lastRenderedPageBreak/>
         <w:t>Incrementa la motivación y el sentido de pertenencia:</w:t>
       </w:r>
       <w:r>
@@ -3300,8 +3901,9 @@
       <w:pPr>
         <w:pStyle w:val="Ttulo2"/>
       </w:pPr>
-      <w:bookmarkStart w:id="5" w:name="_Toc223093759"/>
-      <w:r>
+      <w:bookmarkStart w:id="5" w:name="_Toc223942468"/>
+      <w:r>
+        <w:lastRenderedPageBreak/>
         <w:t>Edición compartida de archivos en línea</w:t>
       </w:r>
       <w:bookmarkEnd w:id="5"/>
@@ -3329,40 +3931,244 @@
         <w:rPr>
           <w:lang w:eastAsia="es-CO"/>
         </w:rPr>
-        <w:t xml:space="preserve">En el plano de las organizaciones, la edición compartida de archivos en línea optimiza los procesos de comunicación y gestión documental, al facilitar y garantizar </w:t>
-      </w:r>
+        <w:t xml:space="preserve">En el plano de las organizaciones, la edición compartida de archivos en línea optimiza los procesos de comunicación y gestión documental, al facilitar y garantizar que se trabaje sobre archivos unificados, lo que reduce errores y tiempos de espera, así como la duplicidad; además estimula la transparencia, el control de cambios y la trazabilidad de los aportes que cada colaborador ha hecho en los diferentes trabajos. </w:t>
+      </w:r>
+    </w:p>
+    <w:p>
+      <w:pPr>
+        <w:rPr>
+          <w:lang w:eastAsia="es-CO"/>
+        </w:rPr>
+      </w:pPr>
+      <w:r>
+        <w:rPr>
+          <w:lang w:eastAsia="es-CO"/>
+        </w:rPr>
+        <w:t>En los entornos empresariales modernos, la edición compartida de archivos se ha convertido en una práctica clave para fortalecer la colaboración y la productividad. Mediante herramientas digitales, los equipos trabajan de forma simultánea, eficiente y organizada. La siguiente tabla muestra ejemplos de cómo las organizaciones aplican esta modalidad para optimizar sus procesos y resultados:</w:t>
+      </w:r>
+      <w:r>
+        <w:rPr>
+          <w:lang w:eastAsia="es-CO"/>
+        </w:rPr>
+        <w:tab/>
+      </w:r>
+      <w:r>
+        <w:rPr>
+          <w:lang w:eastAsia="es-CO"/>
+        </w:rPr>
+        <w:tab/>
+      </w:r>
+      <w:r>
+        <w:rPr>
+          <w:lang w:eastAsia="es-CO"/>
+        </w:rPr>
+        <w:tab/>
+      </w:r>
+      <w:r>
+        <w:rPr>
+          <w:lang w:eastAsia="es-CO"/>
+        </w:rPr>
+        <w:tab/>
+      </w:r>
+      <w:r>
+        <w:rPr>
+          <w:lang w:eastAsia="es-CO"/>
+        </w:rPr>
+        <w:tab/>
+      </w:r>
+      <w:r>
+        <w:rPr>
+          <w:lang w:eastAsia="es-CO"/>
+        </w:rPr>
+        <w:tab/>
+      </w:r>
+      <w:r>
+        <w:rPr>
+          <w:lang w:eastAsia="es-CO"/>
+        </w:rPr>
+        <w:tab/>
+      </w:r>
+      <w:r>
+        <w:rPr>
+          <w:lang w:eastAsia="es-CO"/>
+        </w:rPr>
+        <w:tab/>
+      </w:r>
+      <w:r>
+        <w:rPr>
+          <w:lang w:eastAsia="es-CO"/>
+        </w:rPr>
+        <w:tab/>
+      </w:r>
+      <w:r>
+        <w:rPr>
+          <w:lang w:eastAsia="es-CO"/>
+        </w:rPr>
+        <w:tab/>
+      </w:r>
+      <w:r>
+        <w:rPr>
+          <w:lang w:eastAsia="es-CO"/>
+        </w:rPr>
+        <w:tab/>
+      </w:r>
+      <w:r>
+        <w:rPr>
+          <w:lang w:eastAsia="es-CO"/>
+        </w:rPr>
+        <w:tab/>
+      </w:r>
+      <w:r>
+        <w:rPr>
+          <w:lang w:eastAsia="es-CO"/>
+        </w:rPr>
+        <w:tab/>
+      </w:r>
+      <w:r>
+        <w:rPr>
+          <w:lang w:eastAsia="es-CO"/>
+        </w:rPr>
+        <w:tab/>
+      </w:r>
+      <w:r>
+        <w:rPr>
+          <w:lang w:eastAsia="es-CO"/>
+        </w:rPr>
+        <w:tab/>
+      </w:r>
+      <w:r>
+        <w:rPr>
+          <w:lang w:eastAsia="es-CO"/>
+        </w:rPr>
+        <w:tab/>
+      </w:r>
+      <w:r>
+        <w:rPr>
+          <w:lang w:eastAsia="es-CO"/>
+        </w:rPr>
+        <w:tab/>
+      </w:r>
+      <w:r>
+        <w:rPr>
+          <w:lang w:eastAsia="es-CO"/>
+        </w:rPr>
+        <w:tab/>
+      </w:r>
+      <w:r>
+        <w:rPr>
+          <w:lang w:eastAsia="es-CO"/>
+        </w:rPr>
+        <w:tab/>
+      </w:r>
+      <w:r>
+        <w:rPr>
+          <w:lang w:eastAsia="es-CO"/>
+        </w:rPr>
+        <w:tab/>
+      </w:r>
+      <w:r>
+        <w:rPr>
+          <w:lang w:eastAsia="es-CO"/>
+        </w:rPr>
+        <w:tab/>
+      </w:r>
+      <w:r>
+        <w:rPr>
+          <w:lang w:eastAsia="es-CO"/>
+        </w:rPr>
+        <w:tab/>
+      </w:r>
+      <w:r>
+        <w:rPr>
+          <w:lang w:eastAsia="es-CO"/>
+        </w:rPr>
+        <w:tab/>
+      </w:r>
+      <w:r>
+        <w:rPr>
+          <w:lang w:eastAsia="es-CO"/>
+        </w:rPr>
+        <w:tab/>
+      </w:r>
+      <w:r>
+        <w:rPr>
+          <w:lang w:eastAsia="es-CO"/>
+        </w:rPr>
+        <w:tab/>
+      </w:r>
+      <w:r>
+        <w:rPr>
+          <w:lang w:eastAsia="es-CO"/>
+        </w:rPr>
+        <w:tab/>
+      </w:r>
+      <w:r>
+        <w:rPr>
+          <w:lang w:eastAsia="es-CO"/>
+        </w:rPr>
+        <w:tab/>
+      </w:r>
+      <w:r>
+        <w:rPr>
+          <w:lang w:eastAsia="es-CO"/>
+        </w:rPr>
+        <w:tab/>
+      </w:r>
+      <w:r>
+        <w:rPr>
+          <w:lang w:eastAsia="es-CO"/>
+        </w:rPr>
+        <w:tab/>
+      </w:r>
+      <w:r>
+        <w:rPr>
+          <w:lang w:eastAsia="es-CO"/>
+        </w:rPr>
+        <w:tab/>
+      </w:r>
+      <w:r>
+        <w:rPr>
+          <w:lang w:eastAsia="es-CO"/>
+        </w:rPr>
+        <w:tab/>
+      </w:r>
+      <w:r>
+        <w:rPr>
+          <w:lang w:eastAsia="es-CO"/>
+        </w:rPr>
+        <w:tab/>
+      </w:r>
+      <w:r>
+        <w:rPr>
+          <w:lang w:eastAsia="es-CO"/>
+        </w:rPr>
+        <w:tab/>
+      </w:r>
+      <w:r>
+        <w:rPr>
+          <w:lang w:eastAsia="es-CO"/>
+        </w:rPr>
+        <w:tab/>
+      </w:r>
+      <w:r>
+        <w:rPr>
+          <w:lang w:eastAsia="es-CO"/>
+        </w:rPr>
+        <w:tab/>
+      </w:r>
+    </w:p>
+    <w:p>
+      <w:pPr>
+        <w:pStyle w:val="Tabla"/>
+        <w:rPr>
+          <w:lang w:eastAsia="es-CO"/>
+        </w:rPr>
+      </w:pPr>
       <w:r>
         <w:rPr>
           <w:lang w:eastAsia="es-CO"/>
         </w:rPr>
         <w:lastRenderedPageBreak/>
-        <w:t xml:space="preserve">que se trabaje sobre archivos unificados, lo que reduce errores y tiempos de espera, así como la duplicidad; además estimula la transparencia, el control de cambios y la trazabilidad de los aportes que cada colaborador ha hecho en los diferentes trabajos. </w:t>
-      </w:r>
-    </w:p>
-    <w:p>
-      <w:pPr>
-        <w:rPr>
-          <w:lang w:eastAsia="es-CO"/>
-        </w:rPr>
-      </w:pPr>
-      <w:r>
-        <w:rPr>
-          <w:lang w:eastAsia="es-CO"/>
-        </w:rPr>
-        <w:t>En los entornos empresariales modernos, la edición compartida de archivos se ha convertido en una práctica clave para fortalecer la colaboración y la productividad. Mediante herramientas digitales, los equipos trabajan de forma simultánea, eficiente y organizada. La siguiente tabla muestra ejemplos de cómo las organizaciones aplican esta modalidad para optimizar sus procesos y resultados:</w:t>
-      </w:r>
-    </w:p>
-    <w:p>
-      <w:pPr>
-        <w:pStyle w:val="Tabla"/>
-        <w:rPr>
-          <w:lang w:eastAsia="es-CO"/>
-        </w:rPr>
-      </w:pPr>
-      <w:r>
-        <w:rPr>
-          <w:lang w:eastAsia="es-CO"/>
-        </w:rPr>
         <w:t>Ejemplos de aplicación de edición compartida en línea</w:t>
       </w:r>
     </w:p>
@@ -3656,7 +4462,6 @@
               </w:rPr>
             </w:pPr>
             <w:r>
-              <w:lastRenderedPageBreak/>
               <w:t>Consolidación de datos financieros.</w:t>
             </w:r>
           </w:p>
@@ -3747,7 +4552,11 @@
               </w:rPr>
             </w:pPr>
             <w:r>
-              <w:t>Revisión de políticas internas de la empresa.</w:t>
+              <w:t xml:space="preserve">Revisión de políticas </w:t>
+            </w:r>
+            <w:r>
+              <w:lastRenderedPageBreak/>
+              <w:t>internas de la empresa.</w:t>
             </w:r>
           </w:p>
         </w:tc>
@@ -3763,6 +4572,7 @@
               </w:rPr>
             </w:pPr>
             <w:r>
+              <w:lastRenderedPageBreak/>
               <w:t>SharePoint.</w:t>
             </w:r>
           </w:p>
@@ -3795,7 +4605,11 @@
               </w:rPr>
             </w:pPr>
             <w:r>
-              <w:t>Empleados de distintas sedes comentan y proponen ajustes.</w:t>
+              <w:t xml:space="preserve">Empleados de distintas sedes </w:t>
+            </w:r>
+            <w:r>
+              <w:lastRenderedPageBreak/>
+              <w:t>comentan y proponen ajustes.</w:t>
             </w:r>
           </w:p>
         </w:tc>
@@ -3811,7 +4625,12 @@
               </w:rPr>
             </w:pPr>
             <w:r>
-              <w:t>Mayor participación y alineación organizacional.</w:t>
+              <w:lastRenderedPageBreak/>
+              <w:t xml:space="preserve">Mayor participación y </w:t>
+            </w:r>
+            <w:r>
+              <w:lastRenderedPageBreak/>
+              <w:t>alineación organizacional.</w:t>
             </w:r>
           </w:p>
         </w:tc>
@@ -3832,6 +4651,7 @@
               </w:rPr>
             </w:pPr>
             <w:r>
+              <w:lastRenderedPageBreak/>
               <w:t>Creación de propuestas comerciales para clientes.</w:t>
             </w:r>
           </w:p>
@@ -3930,7 +4750,7 @@
       <w:pPr>
         <w:pStyle w:val="Ttulo2"/>
       </w:pPr>
-      <w:bookmarkStart w:id="6" w:name="_Toc223093760"/>
+      <w:bookmarkStart w:id="6" w:name="_Toc223942469"/>
       <w:r>
         <w:t>Retos en las organizaciones</w:t>
       </w:r>
@@ -3946,40 +4766,322 @@
         <w:rPr>
           <w:lang w:eastAsia="es-CO"/>
         </w:rPr>
-        <w:t xml:space="preserve">El trabajo colaborativo en los entornos digitales representa una gran oportunidad para las empresas que buscan aumentar su productividad y adaptarse a la </w:t>
-      </w:r>
+        <w:t xml:space="preserve">El trabajo colaborativo en los entornos digitales representa una gran oportunidad para las empresas que buscan aumentar su productividad y adaptarse a la transformación digital; aunque su implementación no está exenta de retos y desafíos que podrían afectar la eficiencia y cohesión de los equipos. </w:t>
+      </w:r>
+    </w:p>
+    <w:p>
+      <w:pPr>
+        <w:rPr>
+          <w:lang w:eastAsia="es-CO"/>
+        </w:rPr>
+      </w:pPr>
+      <w:r>
+        <w:rPr>
+          <w:lang w:eastAsia="es-CO"/>
+        </w:rPr>
+        <w:t>A continuación, se presentan algunos de los retos a los que se enfrentan las organizaciones en los trabajos colaborativo en entornos digitales:</w:t>
+      </w:r>
+      <w:r>
+        <w:rPr>
+          <w:lang w:eastAsia="es-CO"/>
+        </w:rPr>
+        <w:tab/>
+      </w:r>
+      <w:r>
+        <w:rPr>
+          <w:lang w:eastAsia="es-CO"/>
+        </w:rPr>
+        <w:tab/>
+      </w:r>
+      <w:r>
+        <w:rPr>
+          <w:lang w:eastAsia="es-CO"/>
+        </w:rPr>
+        <w:tab/>
+      </w:r>
+      <w:r>
+        <w:rPr>
+          <w:lang w:eastAsia="es-CO"/>
+        </w:rPr>
+        <w:tab/>
+      </w:r>
+      <w:r>
+        <w:rPr>
+          <w:lang w:eastAsia="es-CO"/>
+        </w:rPr>
+        <w:tab/>
+      </w:r>
+      <w:r>
+        <w:rPr>
+          <w:lang w:eastAsia="es-CO"/>
+        </w:rPr>
+        <w:tab/>
+      </w:r>
+      <w:r>
+        <w:rPr>
+          <w:lang w:eastAsia="es-CO"/>
+        </w:rPr>
+        <w:tab/>
+      </w:r>
+      <w:r>
+        <w:rPr>
+          <w:lang w:eastAsia="es-CO"/>
+        </w:rPr>
+        <w:tab/>
+      </w:r>
+      <w:r>
+        <w:rPr>
+          <w:lang w:eastAsia="es-CO"/>
+        </w:rPr>
+        <w:tab/>
+      </w:r>
+      <w:r>
+        <w:rPr>
+          <w:lang w:eastAsia="es-CO"/>
+        </w:rPr>
+        <w:tab/>
+      </w:r>
+      <w:r>
+        <w:rPr>
+          <w:lang w:eastAsia="es-CO"/>
+        </w:rPr>
+        <w:tab/>
+      </w:r>
+      <w:r>
+        <w:rPr>
+          <w:lang w:eastAsia="es-CO"/>
+        </w:rPr>
+        <w:tab/>
+      </w:r>
+      <w:r>
+        <w:rPr>
+          <w:lang w:eastAsia="es-CO"/>
+        </w:rPr>
+        <w:tab/>
+      </w:r>
+      <w:r>
+        <w:rPr>
+          <w:lang w:eastAsia="es-CO"/>
+        </w:rPr>
+        <w:tab/>
+      </w:r>
+      <w:r>
+        <w:rPr>
+          <w:lang w:eastAsia="es-CO"/>
+        </w:rPr>
+        <w:tab/>
+      </w:r>
+      <w:r>
+        <w:rPr>
+          <w:lang w:eastAsia="es-CO"/>
+        </w:rPr>
+        <w:tab/>
+      </w:r>
+      <w:r>
+        <w:rPr>
+          <w:lang w:eastAsia="es-CO"/>
+        </w:rPr>
+        <w:tab/>
+      </w:r>
+      <w:r>
+        <w:rPr>
+          <w:lang w:eastAsia="es-CO"/>
+        </w:rPr>
+        <w:tab/>
+      </w:r>
+      <w:r>
+        <w:rPr>
+          <w:lang w:eastAsia="es-CO"/>
+        </w:rPr>
+        <w:tab/>
+      </w:r>
+      <w:r>
+        <w:rPr>
+          <w:lang w:eastAsia="es-CO"/>
+        </w:rPr>
+        <w:tab/>
+      </w:r>
+      <w:r>
+        <w:rPr>
+          <w:lang w:eastAsia="es-CO"/>
+        </w:rPr>
+        <w:tab/>
+      </w:r>
+      <w:r>
+        <w:rPr>
+          <w:lang w:eastAsia="es-CO"/>
+        </w:rPr>
+        <w:tab/>
+      </w:r>
+      <w:r>
+        <w:rPr>
+          <w:lang w:eastAsia="es-CO"/>
+        </w:rPr>
+        <w:tab/>
+      </w:r>
+      <w:r>
+        <w:rPr>
+          <w:lang w:eastAsia="es-CO"/>
+        </w:rPr>
+        <w:tab/>
+      </w:r>
+      <w:r>
+        <w:rPr>
+          <w:lang w:eastAsia="es-CO"/>
+        </w:rPr>
+        <w:tab/>
+      </w:r>
+      <w:r>
+        <w:rPr>
+          <w:lang w:eastAsia="es-CO"/>
+        </w:rPr>
+        <w:tab/>
+      </w:r>
+      <w:r>
+        <w:rPr>
+          <w:lang w:eastAsia="es-CO"/>
+        </w:rPr>
+        <w:tab/>
+      </w:r>
+      <w:r>
+        <w:rPr>
+          <w:lang w:eastAsia="es-CO"/>
+        </w:rPr>
+        <w:tab/>
+      </w:r>
+      <w:r>
+        <w:rPr>
+          <w:lang w:eastAsia="es-CO"/>
+        </w:rPr>
+        <w:tab/>
+      </w:r>
+      <w:r>
+        <w:rPr>
+          <w:lang w:eastAsia="es-CO"/>
+        </w:rPr>
+        <w:tab/>
+      </w:r>
+      <w:r>
+        <w:rPr>
+          <w:lang w:eastAsia="es-CO"/>
+        </w:rPr>
+        <w:tab/>
+      </w:r>
+      <w:r>
+        <w:rPr>
+          <w:lang w:eastAsia="es-CO"/>
+        </w:rPr>
+        <w:tab/>
+      </w:r>
+      <w:r>
+        <w:rPr>
+          <w:lang w:eastAsia="es-CO"/>
+        </w:rPr>
+        <w:tab/>
+      </w:r>
+      <w:r>
+        <w:rPr>
+          <w:lang w:eastAsia="es-CO"/>
+        </w:rPr>
+        <w:tab/>
+      </w:r>
+      <w:r>
+        <w:rPr>
+          <w:lang w:eastAsia="es-CO"/>
+        </w:rPr>
+        <w:tab/>
+      </w:r>
+      <w:r>
+        <w:rPr>
+          <w:lang w:eastAsia="es-CO"/>
+        </w:rPr>
+        <w:tab/>
+      </w:r>
+      <w:r>
+        <w:rPr>
+          <w:lang w:eastAsia="es-CO"/>
+        </w:rPr>
+        <w:tab/>
+      </w:r>
+      <w:r>
+        <w:rPr>
+          <w:lang w:eastAsia="es-CO"/>
+        </w:rPr>
+        <w:tab/>
+      </w:r>
+      <w:r>
+        <w:rPr>
+          <w:lang w:eastAsia="es-CO"/>
+        </w:rPr>
+        <w:tab/>
+      </w:r>
+      <w:r>
+        <w:rPr>
+          <w:lang w:eastAsia="es-CO"/>
+        </w:rPr>
+        <w:tab/>
+      </w:r>
+      <w:r>
+        <w:rPr>
+          <w:lang w:eastAsia="es-CO"/>
+        </w:rPr>
+        <w:tab/>
+      </w:r>
+      <w:r>
+        <w:rPr>
+          <w:lang w:eastAsia="es-CO"/>
+        </w:rPr>
+        <w:tab/>
+      </w:r>
+      <w:r>
+        <w:rPr>
+          <w:lang w:eastAsia="es-CO"/>
+        </w:rPr>
+        <w:tab/>
+      </w:r>
+      <w:r>
+        <w:rPr>
+          <w:lang w:eastAsia="es-CO"/>
+        </w:rPr>
+        <w:tab/>
+      </w:r>
+      <w:r>
+        <w:rPr>
+          <w:lang w:eastAsia="es-CO"/>
+        </w:rPr>
+        <w:tab/>
+      </w:r>
+      <w:r>
+        <w:rPr>
+          <w:lang w:eastAsia="es-CO"/>
+        </w:rPr>
+        <w:tab/>
+      </w:r>
+      <w:r>
+        <w:rPr>
+          <w:lang w:eastAsia="es-CO"/>
+        </w:rPr>
+        <w:tab/>
+      </w:r>
+      <w:r>
+        <w:rPr>
+          <w:lang w:eastAsia="es-CO"/>
+        </w:rPr>
+        <w:tab/>
+      </w:r>
+    </w:p>
+    <w:p>
+      <w:pPr>
+        <w:pStyle w:val="Tabla"/>
+        <w:rPr>
+          <w:lang w:eastAsia="es-CO"/>
+        </w:rPr>
+      </w:pPr>
       <w:r>
         <w:rPr>
           <w:lang w:eastAsia="es-CO"/>
         </w:rPr>
         <w:lastRenderedPageBreak/>
-        <w:t xml:space="preserve">transformación digital; aunque su implementación no está exenta de retos y desafíos que podrían afectar la eficiencia y cohesión de los equipos. </w:t>
-      </w:r>
-    </w:p>
-    <w:p>
-      <w:pPr>
-        <w:rPr>
-          <w:lang w:eastAsia="es-CO"/>
-        </w:rPr>
-      </w:pPr>
-      <w:r>
-        <w:rPr>
-          <w:lang w:eastAsia="es-CO"/>
-        </w:rPr>
-        <w:t>A continuación, se presentan algunos de los retos a los que se enfrentan las organizaciones en los trabajos colaborativo en entornos digitales:</w:t>
-      </w:r>
-    </w:p>
-    <w:p>
-      <w:pPr>
-        <w:pStyle w:val="Tabla"/>
-        <w:rPr>
-          <w:lang w:eastAsia="es-CO"/>
-        </w:rPr>
-      </w:pPr>
-      <w:r>
-        <w:rPr>
-          <w:lang w:eastAsia="es-CO"/>
-        </w:rPr>
         <w:t>Retos a los que se enfrentan las organizaciones en los entornos digitales</w:t>
       </w:r>
     </w:p>
@@ -4189,7 +5291,6 @@
               </w:rPr>
             </w:pPr>
             <w:r>
-              <w:lastRenderedPageBreak/>
               <w:t>Brecha de competencias digitales.</w:t>
             </w:r>
           </w:p>
@@ -4224,6 +5325,7 @@
               </w:rPr>
             </w:pPr>
             <w:r>
+              <w:lastRenderedPageBreak/>
               <w:t>Comunicación asincrónica o dispersa.</w:t>
             </w:r>
           </w:p>
@@ -4366,7 +5468,6 @@
               </w:rPr>
             </w:pPr>
             <w:r>
-              <w:lastRenderedPageBreak/>
               <w:t>Desconexión humana y aislamiento laboral.</w:t>
             </w:r>
           </w:p>
@@ -4395,714 +5496,6 @@
       </w:pPr>
       <w:r>
         <w:t>Fuente: SENA, (2025)</w:t>
-      </w:r>
-      <w:r>
-        <w:tab/>
-      </w:r>
-      <w:r>
-        <w:tab/>
-      </w:r>
-      <w:r>
-        <w:tab/>
-      </w:r>
-      <w:r>
-        <w:tab/>
-      </w:r>
-      <w:r>
-        <w:tab/>
-      </w:r>
-      <w:r>
-        <w:tab/>
-      </w:r>
-      <w:r>
-        <w:tab/>
-      </w:r>
-      <w:r>
-        <w:tab/>
-      </w:r>
-      <w:r>
-        <w:tab/>
-      </w:r>
-      <w:r>
-        <w:tab/>
-      </w:r>
-      <w:r>
-        <w:tab/>
-      </w:r>
-      <w:r>
-        <w:tab/>
-      </w:r>
-      <w:r>
-        <w:tab/>
-      </w:r>
-      <w:r>
-        <w:tab/>
-      </w:r>
-      <w:r>
-        <w:tab/>
-      </w:r>
-      <w:r>
-        <w:tab/>
-      </w:r>
-      <w:r>
-        <w:tab/>
-      </w:r>
-      <w:r>
-        <w:tab/>
-      </w:r>
-      <w:r>
-        <w:tab/>
-      </w:r>
-      <w:r>
-        <w:tab/>
-      </w:r>
-      <w:r>
-        <w:tab/>
-      </w:r>
-      <w:r>
-        <w:tab/>
-      </w:r>
-      <w:r>
-        <w:tab/>
-      </w:r>
-      <w:r>
-        <w:tab/>
-      </w:r>
-      <w:r>
-        <w:tab/>
-      </w:r>
-      <w:r>
-        <w:tab/>
-      </w:r>
-      <w:r>
-        <w:tab/>
-      </w:r>
-      <w:r>
-        <w:tab/>
-      </w:r>
-      <w:r>
-        <w:tab/>
-      </w:r>
-      <w:r>
-        <w:tab/>
-      </w:r>
-      <w:r>
-        <w:tab/>
-      </w:r>
-      <w:r>
-        <w:tab/>
-      </w:r>
-      <w:r>
-        <w:tab/>
-      </w:r>
-      <w:r>
-        <w:tab/>
-      </w:r>
-      <w:r>
-        <w:tab/>
-      </w:r>
-      <w:r>
-        <w:tab/>
-      </w:r>
-      <w:r>
-        <w:tab/>
-      </w:r>
-      <w:r>
-        <w:tab/>
-      </w:r>
-      <w:r>
-        <w:tab/>
-      </w:r>
-      <w:r>
-        <w:tab/>
-      </w:r>
-      <w:r>
-        <w:tab/>
-      </w:r>
-      <w:r>
-        <w:tab/>
-      </w:r>
-      <w:r>
-        <w:tab/>
-      </w:r>
-      <w:r>
-        <w:tab/>
-      </w:r>
-      <w:r>
-        <w:tab/>
-      </w:r>
-      <w:r>
-        <w:tab/>
-      </w:r>
-      <w:r>
-        <w:tab/>
-      </w:r>
-      <w:r>
-        <w:tab/>
-      </w:r>
-      <w:r>
-        <w:tab/>
-      </w:r>
-      <w:r>
-        <w:tab/>
-      </w:r>
-      <w:r>
-        <w:tab/>
-      </w:r>
-      <w:r>
-        <w:tab/>
-      </w:r>
-      <w:r>
-        <w:tab/>
-      </w:r>
-      <w:r>
-        <w:tab/>
-      </w:r>
-      <w:r>
-        <w:tab/>
-      </w:r>
-      <w:r>
-        <w:tab/>
-      </w:r>
-      <w:r>
-        <w:tab/>
-      </w:r>
-      <w:r>
-        <w:tab/>
-      </w:r>
-      <w:r>
-        <w:tab/>
-      </w:r>
-      <w:r>
-        <w:tab/>
-      </w:r>
-      <w:r>
-        <w:tab/>
-      </w:r>
-      <w:r>
-        <w:tab/>
-      </w:r>
-      <w:r>
-        <w:tab/>
-      </w:r>
-      <w:r>
-        <w:tab/>
-      </w:r>
-      <w:r>
-        <w:tab/>
-      </w:r>
-      <w:r>
-        <w:tab/>
-      </w:r>
-      <w:r>
-        <w:tab/>
-      </w:r>
-      <w:r>
-        <w:tab/>
-      </w:r>
-      <w:r>
-        <w:tab/>
-      </w:r>
-      <w:r>
-        <w:tab/>
-      </w:r>
-      <w:r>
-        <w:tab/>
-      </w:r>
-      <w:r>
-        <w:tab/>
-      </w:r>
-      <w:r>
-        <w:tab/>
-      </w:r>
-      <w:r>
-        <w:tab/>
-      </w:r>
-      <w:r>
-        <w:tab/>
-      </w:r>
-      <w:r>
-        <w:tab/>
-      </w:r>
-      <w:r>
-        <w:tab/>
-      </w:r>
-      <w:r>
-        <w:tab/>
-      </w:r>
-      <w:r>
-        <w:tab/>
-      </w:r>
-      <w:r>
-        <w:tab/>
-      </w:r>
-      <w:r>
-        <w:tab/>
-      </w:r>
-      <w:r>
-        <w:tab/>
-      </w:r>
-      <w:r>
-        <w:tab/>
-      </w:r>
-      <w:r>
-        <w:tab/>
-      </w:r>
-      <w:r>
-        <w:tab/>
-      </w:r>
-      <w:r>
-        <w:tab/>
-      </w:r>
-      <w:r>
-        <w:tab/>
-      </w:r>
-      <w:r>
-        <w:tab/>
-      </w:r>
-      <w:r>
-        <w:tab/>
-      </w:r>
-      <w:r>
-        <w:tab/>
-      </w:r>
-      <w:r>
-        <w:tab/>
-      </w:r>
-      <w:r>
-        <w:tab/>
-      </w:r>
-      <w:r>
-        <w:tab/>
-      </w:r>
-      <w:r>
-        <w:tab/>
-      </w:r>
-      <w:r>
-        <w:tab/>
-      </w:r>
-      <w:r>
-        <w:tab/>
-      </w:r>
-      <w:r>
-        <w:tab/>
-      </w:r>
-      <w:r>
-        <w:tab/>
-      </w:r>
-      <w:r>
-        <w:tab/>
-      </w:r>
-      <w:r>
-        <w:tab/>
-      </w:r>
-      <w:r>
-        <w:tab/>
-      </w:r>
-      <w:r>
-        <w:tab/>
-      </w:r>
-      <w:r>
-        <w:tab/>
-      </w:r>
-      <w:r>
-        <w:tab/>
-      </w:r>
-      <w:r>
-        <w:tab/>
-      </w:r>
-      <w:r>
-        <w:tab/>
-      </w:r>
-      <w:r>
-        <w:tab/>
-      </w:r>
-      <w:r>
-        <w:tab/>
-      </w:r>
-      <w:r>
-        <w:tab/>
-      </w:r>
-      <w:r>
-        <w:tab/>
-      </w:r>
-      <w:r>
-        <w:tab/>
-      </w:r>
-      <w:r>
-        <w:tab/>
-      </w:r>
-      <w:r>
-        <w:tab/>
-      </w:r>
-      <w:r>
-        <w:tab/>
-      </w:r>
-      <w:r>
-        <w:tab/>
-      </w:r>
-      <w:r>
-        <w:tab/>
-      </w:r>
-      <w:r>
-        <w:tab/>
-      </w:r>
-      <w:r>
-        <w:tab/>
-      </w:r>
-      <w:r>
-        <w:tab/>
-      </w:r>
-      <w:r>
-        <w:tab/>
-      </w:r>
-      <w:r>
-        <w:tab/>
-      </w:r>
-      <w:r>
-        <w:tab/>
-      </w:r>
-      <w:r>
-        <w:tab/>
-      </w:r>
-      <w:r>
-        <w:tab/>
-      </w:r>
-      <w:r>
-        <w:tab/>
-      </w:r>
-      <w:r>
-        <w:tab/>
-      </w:r>
-      <w:r>
-        <w:tab/>
-      </w:r>
-      <w:r>
-        <w:tab/>
-      </w:r>
-      <w:r>
-        <w:tab/>
-      </w:r>
-      <w:r>
-        <w:tab/>
-      </w:r>
-      <w:r>
-        <w:tab/>
-      </w:r>
-      <w:r>
-        <w:tab/>
-      </w:r>
-      <w:r>
-        <w:tab/>
-      </w:r>
-      <w:r>
-        <w:tab/>
-      </w:r>
-      <w:r>
-        <w:tab/>
-      </w:r>
-      <w:r>
-        <w:tab/>
-      </w:r>
-      <w:r>
-        <w:tab/>
-      </w:r>
-      <w:r>
-        <w:tab/>
-      </w:r>
-      <w:r>
-        <w:tab/>
-      </w:r>
-      <w:r>
-        <w:tab/>
-      </w:r>
-      <w:r>
-        <w:tab/>
-      </w:r>
-      <w:r>
-        <w:tab/>
-      </w:r>
-      <w:r>
-        <w:tab/>
-      </w:r>
-      <w:r>
-        <w:tab/>
-      </w:r>
-      <w:r>
-        <w:tab/>
-      </w:r>
-      <w:r>
-        <w:tab/>
-      </w:r>
-      <w:r>
-        <w:tab/>
-      </w:r>
-      <w:r>
-        <w:tab/>
-      </w:r>
-      <w:r>
-        <w:tab/>
-      </w:r>
-      <w:r>
-        <w:tab/>
-      </w:r>
-      <w:r>
-        <w:tab/>
-      </w:r>
-      <w:r>
-        <w:tab/>
-      </w:r>
-      <w:r>
-        <w:tab/>
-      </w:r>
-      <w:r>
-        <w:tab/>
-      </w:r>
-      <w:r>
-        <w:tab/>
-      </w:r>
-      <w:r>
-        <w:tab/>
-      </w:r>
-      <w:r>
-        <w:tab/>
-      </w:r>
-      <w:r>
-        <w:tab/>
-      </w:r>
-      <w:r>
-        <w:tab/>
-      </w:r>
-      <w:r>
-        <w:tab/>
-      </w:r>
-      <w:r>
-        <w:tab/>
-      </w:r>
-      <w:r>
-        <w:tab/>
-      </w:r>
-      <w:r>
-        <w:tab/>
-      </w:r>
-      <w:r>
-        <w:tab/>
-      </w:r>
-      <w:r>
-        <w:tab/>
-      </w:r>
-      <w:r>
-        <w:tab/>
-      </w:r>
-      <w:r>
-        <w:tab/>
-      </w:r>
-      <w:r>
-        <w:tab/>
-      </w:r>
-      <w:r>
-        <w:tab/>
-      </w:r>
-      <w:r>
-        <w:tab/>
-      </w:r>
-      <w:r>
-        <w:tab/>
-      </w:r>
-      <w:r>
-        <w:tab/>
-      </w:r>
-      <w:r>
-        <w:tab/>
-      </w:r>
-      <w:r>
-        <w:tab/>
-      </w:r>
-      <w:r>
-        <w:tab/>
-      </w:r>
-      <w:r>
-        <w:tab/>
-      </w:r>
-      <w:r>
-        <w:tab/>
-      </w:r>
-      <w:r>
-        <w:tab/>
-      </w:r>
-      <w:r>
-        <w:tab/>
-      </w:r>
-      <w:r>
-        <w:tab/>
-      </w:r>
-      <w:r>
-        <w:tab/>
-      </w:r>
-      <w:r>
-        <w:tab/>
-      </w:r>
-      <w:r>
-        <w:tab/>
-      </w:r>
-      <w:r>
-        <w:tab/>
-      </w:r>
-      <w:r>
-        <w:tab/>
-      </w:r>
-      <w:r>
-        <w:tab/>
-      </w:r>
-      <w:r>
-        <w:tab/>
-      </w:r>
-      <w:r>
-        <w:tab/>
-      </w:r>
-      <w:r>
-        <w:tab/>
-      </w:r>
-      <w:r>
-        <w:tab/>
-      </w:r>
-      <w:r>
-        <w:tab/>
-      </w:r>
-      <w:r>
-        <w:tab/>
-      </w:r>
-      <w:r>
-        <w:tab/>
-      </w:r>
-      <w:r>
-        <w:tab/>
-      </w:r>
-      <w:r>
-        <w:tab/>
-      </w:r>
-      <w:r>
-        <w:tab/>
-      </w:r>
-      <w:r>
-        <w:tab/>
-      </w:r>
-      <w:r>
-        <w:tab/>
-      </w:r>
-      <w:r>
-        <w:tab/>
-      </w:r>
-      <w:r>
-        <w:tab/>
-      </w:r>
-      <w:r>
-        <w:tab/>
-      </w:r>
-      <w:r>
-        <w:tab/>
-      </w:r>
-      <w:r>
-        <w:tab/>
-      </w:r>
-      <w:r>
-        <w:tab/>
-      </w:r>
-      <w:r>
-        <w:tab/>
-      </w:r>
-      <w:r>
-        <w:tab/>
-      </w:r>
-      <w:r>
-        <w:tab/>
-      </w:r>
-      <w:r>
-        <w:tab/>
-      </w:r>
-      <w:r>
-        <w:tab/>
-      </w:r>
-      <w:r>
-        <w:tab/>
-      </w:r>
-      <w:r>
-        <w:tab/>
-      </w:r>
-      <w:r>
-        <w:tab/>
-      </w:r>
-      <w:r>
-        <w:tab/>
-      </w:r>
-      <w:r>
-        <w:tab/>
-      </w:r>
-      <w:r>
-        <w:tab/>
-      </w:r>
-      <w:r>
-        <w:tab/>
-      </w:r>
-      <w:r>
-        <w:tab/>
-      </w:r>
-      <w:r>
-        <w:tab/>
-      </w:r>
-      <w:r>
-        <w:tab/>
-      </w:r>
-      <w:r>
-        <w:tab/>
-      </w:r>
-      <w:r>
-        <w:tab/>
-      </w:r>
-      <w:r>
-        <w:tab/>
-      </w:r>
-      <w:r>
-        <w:tab/>
-      </w:r>
-      <w:r>
-        <w:tab/>
-      </w:r>
-      <w:r>
-        <w:tab/>
-      </w:r>
-      <w:r>
-        <w:tab/>
-      </w:r>
-      <w:r>
-        <w:tab/>
-      </w:r>
-      <w:r>
-        <w:tab/>
-      </w:r>
-      <w:r>
-        <w:tab/>
-      </w:r>
-      <w:r>
-        <w:tab/>
-      </w:r>
-      <w:r>
-        <w:tab/>
-      </w:r>
-      <w:r>
-        <w:tab/>
-      </w:r>
-      <w:r>
-        <w:tab/>
-      </w:r>
-      <w:r>
-        <w:tab/>
-      </w:r>
-      <w:r>
-        <w:tab/>
-      </w:r>
-      <w:r>
-        <w:tab/>
       </w:r>
       <w:r>
         <w:tab/>
@@ -5190,7 +5583,7 @@
         <w:spacing w:after="120"/>
         <w:ind w:left="720"/>
       </w:pPr>
-      <w:bookmarkStart w:id="7" w:name="_Toc223093761"/>
+      <w:bookmarkStart w:id="7" w:name="_Toc223942470"/>
       <w:r>
         <w:lastRenderedPageBreak/>
         <w:t>Teams</w:t>
@@ -6080,7 +6473,7 @@
       <w:pPr>
         <w:pStyle w:val="Ttulo2"/>
       </w:pPr>
-      <w:bookmarkStart w:id="8" w:name="_Toc223093762"/>
+      <w:bookmarkStart w:id="8" w:name="_Toc223942471"/>
       <w:r>
         <w:t>Reuniones en línea</w:t>
       </w:r>
@@ -6610,7 +7003,15 @@
             </w:r>
             <w:proofErr w:type="spellEnd"/>
             <w:r>
-              <w:t xml:space="preserve"> usando Teams, donde los empleados participan y completan evaluaciones en línea.</w:t>
+              <w:t xml:space="preserve"> usando </w:t>
+            </w:r>
+            <w:proofErr w:type="spellStart"/>
+            <w:r>
+              <w:t>Teams</w:t>
+            </w:r>
+            <w:proofErr w:type="spellEnd"/>
+            <w:r>
+              <w:t>, donde los empleados participan y completan evaluaciones en línea.</w:t>
             </w:r>
           </w:p>
         </w:tc>
@@ -7013,7 +7414,7 @@
       <w:pPr>
         <w:pStyle w:val="Ttulo2"/>
       </w:pPr>
-      <w:bookmarkStart w:id="9" w:name="_Toc223093763"/>
+      <w:bookmarkStart w:id="9" w:name="_Toc223942472"/>
       <w:r>
         <w:t>Chat y videollamadas</w:t>
       </w:r>
@@ -7108,7 +7509,7 @@
       <w:pPr>
         <w:pStyle w:val="Ttulo2"/>
       </w:pPr>
-      <w:bookmarkStart w:id="10" w:name="_Toc223093764"/>
+      <w:bookmarkStart w:id="10" w:name="_Toc223942473"/>
       <w:r>
         <w:t>Creación de equipos y canales</w:t>
       </w:r>
@@ -7710,7 +8111,7 @@
       <w:pPr>
         <w:pStyle w:val="Ttulo2"/>
       </w:pPr>
-      <w:bookmarkStart w:id="11" w:name="_Toc223093765"/>
+      <w:bookmarkStart w:id="11" w:name="_Toc223942474"/>
       <w:r>
         <w:t>Integración con otras aplicaciones</w:t>
       </w:r>
@@ -7728,20 +8129,6 @@
         </w:rPr>
         <w:t>Teams tiene la ventaja que permite la integración con un sinnúmero de herramientas digitales o aplicaciones, lo que la potencializa, convirtiéndola en un centro de productividad. Entre las aplicaciones más conocidas que pueden integrarse, se pueden nombrar:</w:t>
       </w:r>
-    </w:p>
-    <w:p>
-      <w:pPr>
-        <w:rPr>
-          <w:lang w:eastAsia="es-CO"/>
-        </w:rPr>
-      </w:pPr>
-    </w:p>
-    <w:p>
-      <w:pPr>
-        <w:rPr>
-          <w:lang w:eastAsia="es-CO"/>
-        </w:rPr>
-      </w:pPr>
     </w:p>
     <w:p>
       <w:pPr>
@@ -7904,7 +8291,6 @@
         <w:rPr>
           <w:lang w:eastAsia="es-CO"/>
         </w:rPr>
-        <w:lastRenderedPageBreak/>
         <w:t>Otras</w:t>
       </w:r>
     </w:p>
@@ -7944,6 +8330,7 @@
         <w:rPr>
           <w:lang w:eastAsia="es-CO"/>
         </w:rPr>
+        <w:lastRenderedPageBreak/>
         <w:t>Trello</w:t>
       </w:r>
       <w:proofErr w:type="spellEnd"/>
@@ -8630,6 +9017,47 @@
           <w:lang w:eastAsia="es-CO"/>
         </w:rPr>
         <w:tab/>
+      </w:r>
+    </w:p>
+    <w:p>
+      <w:pPr>
+        <w:rPr>
+          <w:lang w:eastAsia="es-CO"/>
+        </w:rPr>
+      </w:pPr>
+      <w:r>
+        <w:rPr>
+          <w:lang w:eastAsia="es-CO"/>
+        </w:rPr>
+        <w:t xml:space="preserve">Para mayor comprensión, en los siguientes </w:t>
+      </w:r>
+      <w:proofErr w:type="spellStart"/>
+      <w:r>
+        <w:rPr>
+          <w:lang w:eastAsia="es-CO"/>
+        </w:rPr>
+        <w:t>videotutoriales</w:t>
+      </w:r>
+      <w:proofErr w:type="spellEnd"/>
+      <w:r>
+        <w:rPr>
+          <w:lang w:eastAsia="es-CO"/>
+        </w:rPr>
+        <w:t xml:space="preserve">, puede ampliar la información sobre el funcionamiento de </w:t>
+      </w:r>
+      <w:proofErr w:type="spellStart"/>
+      <w:r>
+        <w:rPr>
+          <w:lang w:eastAsia="es-CO"/>
+        </w:rPr>
+        <w:t>Teams</w:t>
+      </w:r>
+      <w:proofErr w:type="spellEnd"/>
+      <w:r>
+        <w:rPr>
+          <w:lang w:eastAsia="es-CO"/>
+        </w:rPr>
+        <w:t>:</w:t>
       </w:r>
       <w:r>
         <w:rPr>
@@ -8819,7 +9247,6 @@
               <w:rPr>
                 <w:b/>
               </w:rPr>
-              <w:lastRenderedPageBreak/>
               <w:t xml:space="preserve">Síntesis del video: </w:t>
             </w:r>
             <w:r>
@@ -8835,10 +9262,7 @@
           </w:tcPr>
           <w:p>
             <w:r>
-              <w:t>Bueno, vamos a conocer la</w:t>
-            </w:r>
-            <w:r>
-              <w:t xml:space="preserve"> herramienta de Microsoft </w:t>
+              <w:t xml:space="preserve">Bueno, vamos a conocer la herramienta de Microsoft </w:t>
             </w:r>
             <w:proofErr w:type="spellStart"/>
             <w:r>
@@ -8851,18 +9275,12 @@
           </w:p>
           <w:p>
             <w:r>
-              <w:t>Para ello, podemos ingresar por aquí, por aplicaciones de Outlook. Aquí, en el inicio de otras aplicaciones, damos clic. Aquí se nos abren las aplicaciones y vamos a d</w:t>
-            </w:r>
-            <w:r>
-              <w:t>ar clic en esta que dice Teams.</w:t>
-            </w:r>
-          </w:p>
-          <w:p>
-            <w:r>
-              <w:t>Aquí nos están dando la bienvenida.</w:t>
-            </w:r>
-            <w:r>
-              <w:t xml:space="preserve"> Vamos a dar clic en continuar.</w:t>
+              <w:t>Para ello, podemos ingresar por aquí, por aplicaciones de Outlook. Aquí, en el inicio de otras aplicaciones, damos clic. Aquí se nos abren las aplicaciones y vamos a dar clic en esta que dice Teams.</w:t>
+            </w:r>
+          </w:p>
+          <w:p>
+            <w:r>
+              <w:t>Aquí nos están dando la bienvenida. Vamos a dar clic en continuar.</w:t>
             </w:r>
           </w:p>
           <w:p>
@@ -8875,38 +9293,17 @@
             </w:r>
             <w:proofErr w:type="spellEnd"/>
             <w:r>
-              <w:t>. Aquí tenemos para trabajar chat, para generar reuniones o ingresar a reuniones, para trabajar en el tema de comunidades, para agendarnos y para mirar las dife</w:t>
-            </w:r>
-            <w:r>
-              <w:t>rentes actividades que tenemos.</w:t>
-            </w:r>
-          </w:p>
-          <w:p>
-            <w:r>
-              <w:t>En este caso, por ejemplo, en el tema del chat, miren, aquí nos dice que podemos enviar mensajes instantáneos, compartir archivos y mucho más a través del chat. Aquí podemos crear un nuevo chat y contactar a alguien. O</w:t>
-            </w:r>
-            <w:r>
-              <w:t xml:space="preserve"> aquí</w:t>
-            </w:r>
-            <w:r>
-              <w:t>, si lo hacemos p</w:t>
-            </w:r>
-            <w:r>
-              <w:t xml:space="preserve">or medio de una reunión, que </w:t>
-            </w:r>
-            <w:r>
-              <w:t>que</w:t>
-            </w:r>
-            <w:r>
-              <w:t>remos reunirnos en tiempo real.</w:t>
-            </w:r>
-          </w:p>
-          <w:p>
-            <w:r>
-              <w:t>Aquí vamos a dar clic en chat y por aquí buscamos el nombre de la persona, el correo electrónico o el teléfono que tenemos registrado. Claro está que eso sucede cuando ya</w:t>
-            </w:r>
-            <w:r>
-              <w:t xml:space="preserve"> tengamos una lista de correos.</w:t>
+              <w:t>. Aquí tenemos para trabajar chat, para generar reuniones o ingresar a reuniones, para trabajar en el tema de comunidades, para agendarnos y para mirar las diferentes actividades que tenemos.</w:t>
+            </w:r>
+          </w:p>
+          <w:p>
+            <w:r>
+              <w:t>En este caso, por ejemplo, en el tema del chat, miren, aquí nos dice que podemos enviar mensajes instantáneos, compartir archivos y mucho más a través del chat. Aquí podemos crear un nuevo chat y contactar a alguien. O aquí, si lo hacemos por medio de una reunión, que queremos reunirnos en tiempo real.</w:t>
+            </w:r>
+          </w:p>
+          <w:p>
+            <w:r>
+              <w:t>Aquí vamos a dar clic en chat y por aquí buscamos el nombre de la persona, el correo electrónico o el teléfono que tenemos registrado. Claro está que eso sucede cuando ya tengamos una lista de correos.</w:t>
             </w:r>
             <w:r>
               <w:t xml:space="preserve"> En este caso como el correo es nuevo.</w:t>
@@ -8926,171 +9323,186 @@
               <w:t xml:space="preserve">aquí podemos </w:t>
             </w:r>
             <w:r>
-              <w:t xml:space="preserve">unirnos por medio de una ID, o sea, el identificador de la reunión. Por lo </w:t>
-            </w:r>
-            <w:r>
-              <w:t>general, se utiliza un vínculo.</w:t>
-            </w:r>
-          </w:p>
-          <w:p>
-            <w:r>
+              <w:t>unirnos por medio de una ID, o sea, el identificador de la reunión. Por lo general, se utiliza un vínculo.</w:t>
+            </w:r>
+          </w:p>
+          <w:p>
+            <w:r>
+              <w:lastRenderedPageBreak/>
               <w:t xml:space="preserve">Aquí creamos la reunión. Ahorita miramos </w:t>
             </w:r>
             <w:r>
               <w:t xml:space="preserve">aquí en </w:t>
             </w:r>
             <w:r>
-              <w:t xml:space="preserve">el tema de las comunidades. Aquí vamos a crear las comunidades. Aquí en calendario podemos ir creando una </w:t>
+              <w:t>el tema de las comunidades. Aquí vamos a crear las comunidades. Aquí en calendario podemos ir creando una agenda de las diferentes reuniones y aquí vamos viendo la actividad que se va generando.</w:t>
+            </w:r>
+          </w:p>
+          <w:p>
+            <w:r>
+              <w:t>Por ejemplo, aquí en el tema de reuniones: crear un vínculo de reunión. Le damos en crear y copiar vínculo. Miren, aquí ya hemos creado la reunión. Si quiero co</w:t>
+            </w:r>
+            <w:r>
+              <w:t>mpartir el vínculo, aquí le doy compartir</w:t>
+            </w:r>
+            <w:r>
+              <w:t xml:space="preserve"> “copiado”. Entonces, ya yo puedo tomar ese vínculo y enviárselo a alguien vía WhatsApp o por correo electrónico.</w:t>
+            </w:r>
+          </w:p>
+          <w:p>
+            <w:r>
+              <w:t>Unirse. Vamos a unirnos a la reunión. Aquí me está pidiendo que le dé unas autorizaciones. Entonces, yo le voy a decir aquí permitir mientras visitas el sitio.</w:t>
+            </w:r>
+          </w:p>
+          <w:p>
+            <w:r>
+              <w:t xml:space="preserve">Entonces, miren aquí. Bueno, la cámara está apagada. Por lo general, él </w:t>
+            </w:r>
+            <w:r>
+              <w:t>deshabilita esto o sea deshabilita no  desactiva</w:t>
+            </w:r>
+            <w:r>
+              <w:t xml:space="preserve"> cuando nosotros ingresamos a una reunión, para no entrar con el micrófono abierto. Damos clic aquí en permitir.</w:t>
+            </w:r>
+          </w:p>
+          <w:p>
+            <w:r>
+              <w:t>Entonces, miren, ya aquí estamos dentro de una reunión. Aquí mostram</w:t>
+            </w:r>
+            <w:r>
+              <w:t>os el chat de la reunión. Aquí</w:t>
+            </w:r>
+            <w:r>
+              <w:t xml:space="preserve"> quiénes están conectados.</w:t>
+            </w:r>
+          </w:p>
+          <w:p>
+            <w:r>
+              <w:t>Si deseamos participar, ténganlo en cuenta dentro de las reglas cuando estamos en una reunión, para no estar interrumpiendo. Si deseamos participar, aquí alzamos la mano y, miren, cuando ya hemos participado, por ejemplo, he</w:t>
+            </w:r>
+            <w:r>
+              <w:t>mos tenido nuestra interlocución</w:t>
+            </w:r>
+            <w:r>
+              <w:t>, le damos aquí para bajar la mano.</w:t>
+            </w:r>
+          </w:p>
+          <w:p>
+            <w:r>
+              <w:t xml:space="preserve">Aquí, si queremos enviar una reacción, por ejemplo: me gusta, me encanta, aplauso. Aquí, si queremos cambiar la vista, por ejemplo, orador o galería, y aquí nos va dando otras opciones: mostrar en galería, desactivar video entrante, ocultarme o </w:t>
             </w:r>
             <w:r>
               <w:lastRenderedPageBreak/>
-              <w:t>agenda de las diferentes reuniones y aquí vamos viendo la</w:t>
-            </w:r>
-            <w:r>
-              <w:t xml:space="preserve"> actividad que se va generando.</w:t>
-            </w:r>
-          </w:p>
-          <w:p>
-            <w:r>
-              <w:t>Por ejemplo, aquí en el tema de reuniones: crear un vínculo de reunión. Le damos en crear y copiar vínculo. Miren, aquí ya hemos creado la reunión. Si quiero co</w:t>
-            </w:r>
-            <w:r>
-              <w:t>mpartir el vínculo, aquí le doy compartir</w:t>
-            </w:r>
-            <w:r>
-              <w:t xml:space="preserve"> “copiado”. Entonces, ya yo puedo tomar ese vínculo y enviárselo a alguien vía Wha</w:t>
-            </w:r>
-            <w:r>
-              <w:t>tsApp o por correo electrónico.</w:t>
-            </w:r>
-          </w:p>
-          <w:p>
-            <w:r>
-              <w:t>Unirse. Vamos a unirnos a la reunión. Aquí me está pidiendo que le dé unas autorizaciones. Entonces, yo le voy a decir aquí perm</w:t>
-            </w:r>
-            <w:r>
-              <w:t>itir mientras visitas el sitio.</w:t>
-            </w:r>
-          </w:p>
-          <w:p>
-            <w:r>
-              <w:t xml:space="preserve">Entonces, miren aquí. Bueno, la cámara está apagada. Por lo general, él </w:t>
-            </w:r>
-            <w:r>
-              <w:t>deshabilita esto o sea deshabilita no  desactiva</w:t>
-            </w:r>
-            <w:r>
-              <w:t xml:space="preserve"> cuando nosotros ingresamos a una reunión, para no entrar con el micrófono abiert</w:t>
-            </w:r>
-            <w:r>
-              <w:t>o. Damos clic aquí en permitir.</w:t>
-            </w:r>
-          </w:p>
-          <w:p>
-            <w:r>
-              <w:t>Entonces, miren, ya aquí estamos dentro de una reunión. Aquí mostram</w:t>
-            </w:r>
-            <w:r>
-              <w:t>os el chat de la reunión. Aquí</w:t>
-            </w:r>
-            <w:r>
-              <w:t xml:space="preserve"> quiénes están conectados.</w:t>
-            </w:r>
-          </w:p>
-          <w:p>
-            <w:r>
-              <w:t>Si deseamos participar, ténganlo en cuenta dentro de las reglas cuando estamos en una reunión, para no estar interrumpiendo. Si deseamos participar, aquí alzamos la mano y, miren, cuando ya hemos participado, por ejemplo, he</w:t>
-            </w:r>
-            <w:r>
-              <w:t>mos tenido nuestra interlocución</w:t>
-            </w:r>
-            <w:r>
-              <w:t>, le</w:t>
-            </w:r>
-            <w:r>
-              <w:t xml:space="preserve"> damos aquí para bajar la mano.</w:t>
-            </w:r>
-          </w:p>
-          <w:p>
-            <w:r>
-              <w:t>Aquí, si queremos enviar una reacción, por ejemplo: me gusta, me encanta, aplauso. Aquí, si queremos cambiar la vista, por ejemplo, orador o galería, y aquí nos va dando otras opciones: mostrar en galería, desactivar video entrante, ocultarme o quitarme de la galería. Entonces, esto lo podemos ir viendo cuand</w:t>
-            </w:r>
-            <w:r>
-              <w:t>o estamos dentro de la reunión.</w:t>
+              <w:t>quitarme de la galería. Entonces, esto lo podemos ir viendo cuando estamos dentro de la reunión.</w:t>
+            </w:r>
+          </w:p>
+          <w:p>
+            <w:r>
+              <w:t>Aquí tenemos información de la reunión. Si queremos configuración y efectos, configuración de audio o idioma. Esto es bueno, por ejemplo, el tema de los idiomas, porque a veces se hace transcripción. Entonces, indicar el idiom</w:t>
+            </w:r>
+            <w:r>
+              <w:t>a en el cual estamos trabajando y</w:t>
+            </w:r>
+            <w:r>
+              <w:t xml:space="preserve"> sobre todo si queremos que vaya mostrando los subtítulos en directo.</w:t>
+            </w:r>
+          </w:p>
+          <w:p>
+            <w:r>
+              <w:t>Acá, por ejemplo, efectos de video. Si queremos colocar un fondo, entonces, cuando estamos con el video, aquí le colocamos un fondo que sale detrás de nosotros y tapa todo lo que tenemos alrededor, por ejemplo, cuando estamos en el cuarto.</w:t>
+            </w:r>
+          </w:p>
+          <w:p>
+            <w:r>
+              <w:t>Aquí activamos o desactivamos la cámara, o sea, la encendemos o la apagamos para que no nos vean. El micrófono lo usamos mie</w:t>
+            </w:r>
+            <w:r>
+              <w:t>ntras estamos en la interlocución</w:t>
+            </w:r>
+            <w:r>
+              <w:t xml:space="preserve"> y, cuando no estemos interactuando, lo recomendable es mantener el micrófono apagado para que no se filtren ruidos.</w:t>
+            </w:r>
+          </w:p>
+          <w:p>
+            <w:r>
+              <w:t>Cuando deseamos compartir pantalla, por ejemplo, aquí le decimos pantalla y aquí nos da las opciones. Cuando, por ejemplo, yo estoy en el navegador Chrome, si tengo otras pestañas</w:t>
+            </w:r>
+            <w:r>
+              <w:t xml:space="preserve"> Chrome abiertas, aquí</w:t>
+            </w:r>
+            <w:r>
+              <w:t xml:space="preserve"> ventana </w:t>
+            </w:r>
+            <w:r>
+              <w:t xml:space="preserve">ya </w:t>
+            </w:r>
+            <w:r>
+              <w:t>escojo cualquiera de las ventanas, por ejemplo, si voy a presentar unas diapositivas o si voy a compartir un documento en PDF. Entonces, ya yo lo escojo acá.</w:t>
+            </w:r>
+          </w:p>
+          <w:p>
+            <w:r>
+              <w:t xml:space="preserve">Y en este caso, cuando quiero mostrar toda la actividad que tengo en el computador en ese momento, le doy aquí compartir pantalla completa. Entonces, todo lo que yo vaya haciendo lo van a </w:t>
+            </w:r>
+            <w:r>
+              <w:t>ver en la reunión. En este caso yo</w:t>
+            </w:r>
+            <w:r>
+              <w:t xml:space="preserve"> selecciono y le doy aquí compartir.</w:t>
             </w:r>
           </w:p>
           <w:p>
             <w:r>
               <w:lastRenderedPageBreak/>
-              <w:t>Aquí tenemos información de la reunión. Si queremos configuración y efectos, configuración de audio o idioma. Esto es bueno, por ejemplo, el tema de los idiomas, porque a veces se hace transcripción. Entonces, indicar el idiom</w:t>
-            </w:r>
-            <w:r>
-              <w:t>a en el cual estamos trabajando y</w:t>
-            </w:r>
-            <w:r>
-              <w:t xml:space="preserve"> sobre todo si queremos que vaya mostr</w:t>
-            </w:r>
-            <w:r>
-              <w:t>ando los subtítulos en directo.</w:t>
-            </w:r>
-          </w:p>
-          <w:p>
-            <w:r>
-              <w:t>Acá, por ejemplo, efectos de video. Si queremos colocar un fondo, entonces, cuando estamos con el video, aquí le colocamos un fondo que sale detrás de nosotros y tapa todo lo que tenemos alrededor, por ejempl</w:t>
-            </w:r>
-            <w:r>
-              <w:t>o, cuando estamos en el cuarto.</w:t>
-            </w:r>
-          </w:p>
-          <w:p>
-            <w:r>
-              <w:t>Aquí activamos o desactivamos la cámara, o sea, la encendemos o la apagamos para que no nos vean. El micrófono lo usamos mie</w:t>
-            </w:r>
-            <w:r>
-              <w:t>ntras estamos en la interlocución</w:t>
-            </w:r>
-            <w:r>
-              <w:t xml:space="preserve"> y, cuando no estemos interactuando, lo recomendable es mantener el micrófono apagado</w:t>
-            </w:r>
-            <w:r>
-              <w:t xml:space="preserve"> para que no se filtren ruidos.</w:t>
-            </w:r>
-          </w:p>
-          <w:p>
-            <w:r>
-              <w:t>Cuando deseamos compartir pantalla, por ejemplo, aquí le decimos pantalla y aquí nos da las opciones. Cuando, por ejemplo, yo estoy en el navegador Chrome, si tengo otras pestañas</w:t>
-            </w:r>
-            <w:r>
-              <w:t xml:space="preserve"> Chrome abiertas, aquí</w:t>
-            </w:r>
-            <w:r>
-              <w:t xml:space="preserve"> ventana </w:t>
-            </w:r>
-            <w:r>
-              <w:t xml:space="preserve">ya </w:t>
-            </w:r>
-            <w:r>
-              <w:t>escojo cualquiera de las ventanas, por ejemplo, si voy a presentar unas diapositivas o si voy a compartir un documento en PDF.</w:t>
-            </w:r>
-            <w:r>
-              <w:t xml:space="preserve"> Entonces, ya yo lo escojo acá.</w:t>
-            </w:r>
-          </w:p>
-          <w:p>
-            <w:r>
-              <w:t xml:space="preserve">Y en este caso, cuando quiero mostrar toda la actividad que tengo en el computador en ese momento, le doy aquí compartir pantalla completa. Entonces, todo lo que yo vaya haciendo lo van a </w:t>
-            </w:r>
-            <w:r>
-              <w:t>ver en la reunión. En este caso yo</w:t>
-            </w:r>
-            <w:r>
-              <w:t xml:space="preserve"> selecciono y le doy aquí compartir.</w:t>
-            </w:r>
-          </w:p>
-          <w:p>
-            <w:r>
-              <w:lastRenderedPageBreak/>
-              <w:t>Entonces, las otras personas que estén en la reunión van a ver todo lo que yo estoy haciendo. Cuando quiero dejar de compartir, simplemente le doy aquí dejar de compartir</w:t>
+              <w:t>Entonces, las otras personas que estén en la reunión van a ver todo lo que yo estoy haciendo. Cuando quiero dejar de compartir, simplemente le doy aquí dejar de compartir.</w:t>
+            </w:r>
+          </w:p>
+          <w:p>
+            <w:r>
+              <w:t>Cuando quiero terminar l</w:t>
+            </w:r>
+            <w:r>
+              <w:t xml:space="preserve">a reunión, le doy aquí salir o </w:t>
+            </w:r>
+            <w:r>
+              <w:t>cuando</w:t>
+            </w:r>
+            <w:r>
+              <w:t xml:space="preserve"> quiero salir y cuando</w:t>
+            </w:r>
+            <w:r>
+              <w:t xml:space="preserve"> he sido yo quien ha organizado la reunión y hay varios conectados que no han salido, entonces le doy aquí finalizar la reunión y termina para todos.</w:t>
+            </w:r>
+          </w:p>
+          <w:p>
+            <w:r>
+              <w:t>En este caso, voy a finalizar la reunión. Miren, aquí lleva un conteo de cuánto va durando</w:t>
+            </w:r>
+            <w:r>
+              <w:t xml:space="preserve"> la </w:t>
+            </w:r>
+            <w:r>
+              <w:t>reunión</w:t>
+            </w:r>
+            <w:r>
+              <w:t>. Aquí vamos a darle finalizar la reunión. Terminado.</w:t>
+            </w:r>
+          </w:p>
+          <w:p>
+            <w:r>
+              <w:t>Si deseo programar una reunión, como yo estoy utilizando una cuenta gratuita, entonces me dic</w:t>
+            </w:r>
+            <w:r>
+              <w:t>e que tengo hasta 60 minutos para la</w:t>
+            </w:r>
+            <w:r>
+              <w:t xml:space="preserve"> reunión y puedo conectar hasta un máximo de 100 participantes</w:t>
+            </w:r>
+            <w:r>
+              <w:t xml:space="preserve"> durante esa </w:t>
+            </w:r>
+            <w:r>
+              <w:t>reunión</w:t>
             </w:r>
             <w:r>
               <w:t>.</w:t>
@@ -9098,70 +9510,7 @@
           </w:p>
           <w:p>
             <w:r>
-              <w:t>Cuando quiero terminar l</w:t>
-            </w:r>
-            <w:r>
-              <w:t xml:space="preserve">a reunión, le doy aquí salir o </w:t>
-            </w:r>
-            <w:r>
-              <w:t>cuando</w:t>
-            </w:r>
-            <w:r>
-              <w:t xml:space="preserve"> quiero salir y cuando</w:t>
-            </w:r>
-            <w:r>
-              <w:t xml:space="preserve"> he sido yo quien ha organizado la reunión y hay varios conectados que no han salido, entonces le doy aquí finalizar l</w:t>
-            </w:r>
-            <w:r>
-              <w:t>a reunión y termina para todos.</w:t>
-            </w:r>
-          </w:p>
-          <w:p>
-            <w:r>
-              <w:t>En este caso, voy a finalizar la reunión. Miren, aquí lleva un conteo de cuánto va durando</w:t>
-            </w:r>
-            <w:r>
-              <w:t xml:space="preserve"> la </w:t>
-            </w:r>
-            <w:r>
-              <w:t>reunión</w:t>
-            </w:r>
-            <w:r>
-              <w:t>. Aquí vamos a darle f</w:t>
-            </w:r>
-            <w:r>
-              <w:t>inalizar la reunión. Terminado.</w:t>
-            </w:r>
-          </w:p>
-          <w:p>
-            <w:r>
-              <w:t>Si deseo programar una reunión, como yo estoy utilizando una cuenta gratuita, entonces me dic</w:t>
-            </w:r>
-            <w:r>
-              <w:t>e que tengo hasta 60 minutos para la</w:t>
-            </w:r>
-            <w:r>
-              <w:t xml:space="preserve"> reunión y puedo conectar hasta </w:t>
-            </w:r>
-            <w:r>
-              <w:t>un máximo de 100 participantes</w:t>
-            </w:r>
-            <w:r>
-              <w:t xml:space="preserve"> durante esa </w:t>
-            </w:r>
-            <w:r>
-              <w:t>reunión</w:t>
-            </w:r>
-            <w:r>
-              <w:t>.</w:t>
-            </w:r>
-          </w:p>
-          <w:p>
-            <w:r>
-              <w:t>Entonces, vamos aquí a agregar un título, digamos que una reunión sobre un proyecto de investigación. Aquí escribimos las direcciones de correo de quienes deseamos invitar</w:t>
-            </w:r>
-            <w:r>
-              <w:t>, cuando la reunión es privada.</w:t>
+              <w:t>Entonces, vamos aquí a agregar un título, digamos que una reunión sobre un proyecto de investigación. Aquí escribimos las direcciones de correo de quienes deseamos invitar, cuando la reunión es privada.</w:t>
             </w:r>
           </w:p>
           <w:p>
@@ -9178,18 +9527,12 @@
               <w:t>, ingresan por link</w:t>
             </w:r>
             <w:r>
-              <w:t xml:space="preserve"> y nosotros t</w:t>
-            </w:r>
-            <w:r>
-              <w:t>enemos que autorizar su acceso.</w:t>
-            </w:r>
-          </w:p>
-          <w:p>
-            <w:r>
-              <w:t>Tenemos invitado a alguien acá. Vamos a decir que la reunión es a las 10 de la mañana. Vamos a poner el día, a las 10</w:t>
-            </w:r>
-            <w:r>
-              <w:t xml:space="preserve"> de la mañana, y </w:t>
+              <w:t xml:space="preserve"> y nosotros tenemos que autorizar su acceso.</w:t>
+            </w:r>
+          </w:p>
+          <w:p>
+            <w:r>
+              <w:t xml:space="preserve">Tenemos invitado a alguien acá. Vamos a decir que la reunión es a las 10 de la mañana. Vamos a poner el día, a las 10 de la mañana, y </w:t>
             </w:r>
             <w:r>
               <w:t xml:space="preserve">empieza </w:t>
@@ -9225,15 +9568,6 @@
     </w:tbl>
     <w:p>
       <w:pPr>
-        <w:spacing w:before="0" w:after="0"/>
-        <w:ind w:firstLine="0"/>
-        <w:rPr>
-          <w:lang w:eastAsia="es-CO"/>
-        </w:rPr>
-      </w:pPr>
-    </w:p>
-    <w:p>
-      <w:pPr>
         <w:pStyle w:val="Video"/>
         <w:jc w:val="left"/>
         <w:rPr>
@@ -9244,6 +9578,7 @@
         <w:rPr>
           <w:lang w:eastAsia="es-CO"/>
         </w:rPr>
+        <w:lastRenderedPageBreak/>
         <w:t>Equipos y canales en Teams.</w:t>
       </w:r>
     </w:p>
@@ -9378,35 +9713,23 @@
           </w:tcPr>
           <w:p>
             <w:r>
-              <w:t xml:space="preserve">Bueno, aquí, en el tema de los equipos, esto ya no hace parte de las cuentas gratuitas, sino que hay que trabajarlo desde una cuenta corporativa. En este momento yo estoy en una cuenta </w:t>
-            </w:r>
-            <w:r>
-              <w:t>corporativa, desde los equipos.</w:t>
+              <w:t>Bueno, aquí, en el tema de los equipos, esto ya no hace parte de las cuentas gratuitas, sino que hay que trabajarlo desde una cuenta corporativa. En este momento yo estoy en una cuenta corporativa, desde los equipos.</w:t>
+            </w:r>
+          </w:p>
+          <w:p>
+            <w:r>
+              <w:t>Miren que este menú que encontramos acá es más amplio que el que tenemos en la cuenta gratuita. Ahora, con las cuentas gratuitas podemos trabajar lo que son comunidades.</w:t>
             </w:r>
           </w:p>
           <w:p>
             <w:r>
               <w:lastRenderedPageBreak/>
-              <w:t>Miren que este menú que encontramos acá es más amplio que el que tenemos en la cuenta gratuita. Ahora, con las cuentas gratuitas podemos trabajar lo que so</w:t>
-            </w:r>
-            <w:r>
-              <w:t>n comunidades.</w:t>
-            </w:r>
-          </w:p>
-          <w:p>
-            <w:r>
-              <w:t xml:space="preserve">Entonces, aquí para crear un equipo, dice “Unirse a un equipo” o “Crear un nuevo equipo”. En este caso, le vamos a dar aquí al más </w:t>
-            </w:r>
-            <w:r>
-              <w:t>(+) para crear un nuevo equipo.</w:t>
-            </w:r>
-          </w:p>
-          <w:p>
-            <w:r>
-              <w:t>Entonces, si lo queremos desde plantilla, de otro equipo o desde grupo. Aquí me salen estas plantillas, ya que la cuenta corporativa que estoy utilizando pertenece a una entidad educativa. Entonces, digamos que aquí vamos a utilizar estas opciones. Tanto formadores como alumnos pueden crear equipos para colaborar. En este caso, us</w:t>
-            </w:r>
-            <w:r>
-              <w:t>ar esta plantilla.</w:t>
+              <w:t>Entonces, aquí para crear un equipo, dice “Unirse a un equipo” o “Crear un nuevo equipo”. En este caso, le vamos a dar aquí al más (+) para crear un nuevo equipo.</w:t>
+            </w:r>
+          </w:p>
+          <w:p>
+            <w:r>
+              <w:t>Entonces, si lo queremos desde plantilla, de otro equipo o desde grupo. Aquí me salen estas plantillas, ya que la cuenta corporativa que estoy utilizando pertenece a una entidad educativa. Entonces, digamos que aquí vamos a utilizar estas opciones. Tanto formadores como alumnos pueden crear equipos para colaborar. En este caso, usar esta plantilla.</w:t>
             </w:r>
           </w:p>
           <w:p>
@@ -9417,18 +9740,12 @@
               <w:t>ser de carácter privado</w:t>
             </w:r>
             <w:r>
-              <w:t>, solo las personas miembros pueden ingresar o quienes tengamos autorizados a unirse, o público, donde cualquiera puede unirse. En este caso, lo vamos a hacer priv</w:t>
-            </w:r>
-            <w:r>
-              <w:t>ado.</w:t>
-            </w:r>
-          </w:p>
-          <w:p>
-            <w:r>
-              <w:t>Nombre del equipo. Escribimos un</w:t>
-            </w:r>
-            <w:r>
-              <w:t>a descripción y le damos crear.</w:t>
+              <w:t>, solo las personas miembros pueden ingresar o quienes tengamos autorizados a unirse, o público, donde cualquiera puede unirse. En este caso, lo vamos a hacer privado.</w:t>
+            </w:r>
+          </w:p>
+          <w:p>
+            <w:r>
+              <w:t>Nombre del equipo. Escribimos una descripción y le damos crear.</w:t>
             </w:r>
           </w:p>
           <w:p>
@@ -9439,10 +9756,7 @@
               <w:t>uenta de correo electrónico o le vamos a dar el nombre</w:t>
             </w:r>
             <w:r>
-              <w:t xml:space="preserve"> si lo tenemos en nuestra lista de contactos; lo va mostrando allí y lo vamos seleccionando. En es</w:t>
-            </w:r>
-            <w:r>
-              <w:t>te caso, le vamos a dar omitir.</w:t>
+              <w:t xml:space="preserve"> si lo tenemos en nuestra lista de contactos; lo va mostrando allí y lo vamos seleccionando. En este caso, le vamos a dar omitir.</w:t>
             </w:r>
           </w:p>
           <w:p>
@@ -9471,27 +9785,24 @@
               <w:t xml:space="preserve">si queremos </w:t>
             </w:r>
             <w:r>
-              <w:t xml:space="preserve">copiar el vínculo y </w:t>
-            </w:r>
+              <w:t xml:space="preserve">copiar el vínculo y compartirlo, </w:t>
+            </w:r>
+            <w:r>
+              <w:t>si queremos salir del grupo, administrar</w:t>
+            </w:r>
+            <w:r>
+              <w:t xml:space="preserve"> etiquetas o</w:t>
+            </w:r>
+            <w:r>
+              <w:t xml:space="preserve"> si queremos </w:t>
+            </w:r>
+            <w:r>
+              <w:t xml:space="preserve"> eliminarlo. En este caso, le vamos a dar agregar canal.</w:t>
+            </w:r>
+          </w:p>
+          <w:p>
             <w:r>
               <w:lastRenderedPageBreak/>
-              <w:t xml:space="preserve">compartirlo, </w:t>
-            </w:r>
-            <w:r>
-              <w:t>si queremos salir del grupo, administrar</w:t>
-            </w:r>
-            <w:r>
-              <w:t xml:space="preserve"> etiquetas o</w:t>
-            </w:r>
-            <w:r>
-              <w:t xml:space="preserve"> si queremos </w:t>
-            </w:r>
-            <w:r>
-              <w:t xml:space="preserve"> eliminarlo. En este caso, le vamos a dar agregar canal.</w:t>
-            </w:r>
-          </w:p>
-          <w:p>
-            <w:r>
               <w:t xml:space="preserve">Entonces, aquí </w:t>
             </w:r>
             <w:r>
@@ -9507,10 +9818,7 @@
               <w:t>. “Se</w:t>
             </w:r>
             <w:r>
-              <w:t xml:space="preserve"> revisarán lo</w:t>
-            </w:r>
-            <w:r>
-              <w:t xml:space="preserve">s términos de la </w:t>
+              <w:t xml:space="preserve"> revisarán los términos de la </w:t>
             </w:r>
             <w:r>
               <w:t>convocatoria”. Aquí la descripción.</w:t>
@@ -9530,42 +9838,27 @@
               <w:t>eden tener acceso. Privado: las</w:t>
             </w:r>
             <w:r>
-              <w:t xml:space="preserve"> personas específicas del equipo tienen</w:t>
-            </w:r>
-            <w:r>
-              <w:t xml:space="preserve"> acceso.</w:t>
-            </w:r>
-          </w:p>
-          <w:p>
-            <w:r>
-              <w:t>E</w:t>
-            </w:r>
-            <w:r>
-              <w:t>n este caso, le damos estándar.</w:t>
-            </w:r>
-          </w:p>
-          <w:p>
-            <w:r>
-              <w:t>Aquí dice: “Recomendar a los usuarios que tengan este canal en su lista de canales”. Si queremos, lo dej</w:t>
-            </w:r>
-            <w:r>
-              <w:t>amos activado y le damos crear.</w:t>
-            </w:r>
-          </w:p>
-          <w:p>
-            <w:r>
-              <w:t xml:space="preserve">Vamos a crear otro canal. Entonces, este canal se llama “Primer canal”. Aquí la descripción. Elegir el canal </w:t>
-            </w:r>
-            <w:r>
-              <w:t>estándar y le damos aquí crear.</w:t>
-            </w:r>
-          </w:p>
-          <w:p>
-            <w:r>
-              <w:t>Entonces, miren, aquí tenemos el equipo y aquí tenemos los canales. Miren que aquí estamos en el canal “Seminario permanente de investigación” del equipo “Proyecto en ciencia”. Ahí nos damos cuent</w:t>
-            </w:r>
-            <w:r>
-              <w:t>a porque aquí aparece la sigla.</w:t>
+              <w:t xml:space="preserve"> personas específicas del equipo tienen acceso.</w:t>
+            </w:r>
+          </w:p>
+          <w:p>
+            <w:r>
+              <w:t>En este caso, le damos estándar.</w:t>
+            </w:r>
+          </w:p>
+          <w:p>
+            <w:r>
+              <w:t>Aquí dice: “Recomendar a los usuarios que tengan este canal en su lista de canales”. Si queremos, lo dejamos activado y le damos crear.</w:t>
+            </w:r>
+          </w:p>
+          <w:p>
+            <w:r>
+              <w:t>Vamos a crear otro canal. Entonces, este canal se llama “Primer canal”. Aquí la descripción. Elegir el canal estándar y le damos aquí crear.</w:t>
+            </w:r>
+          </w:p>
+          <w:p>
+            <w:r>
+              <w:t>Entonces, miren, aquí tenemos el equipo y aquí tenemos los canales. Miren que aquí estamos en el canal “Seminario permanente de investigación” del equipo “Proyecto en ciencia”. Ahí nos damos cuenta porque aquí aparece la sigla.</w:t>
             </w:r>
           </w:p>
           <w:p>
@@ -9588,31 +9881,22 @@
               <w:t xml:space="preserve">jes que quedan compartidos </w:t>
             </w:r>
             <w:r>
-              <w:t>todos. Si queremos adjuntar archivos, tamb</w:t>
-            </w:r>
-            <w:r>
-              <w:t>ién aquí en archivo.</w:t>
-            </w:r>
-          </w:p>
-          <w:p>
-            <w:r>
-              <w:t>Si queremos agregar archivo, car</w:t>
-            </w:r>
-            <w:r>
-              <w:t>gar, aquí tenemos las opciones.</w:t>
+              <w:t>todos. Si queremos adjuntar archivos, también aquí en archivo.</w:t>
+            </w:r>
+          </w:p>
+          <w:p>
+            <w:r>
+              <w:t>Si queremos agregar archivo, cargar, aquí tenemos las opciones.</w:t>
+            </w:r>
+          </w:p>
+          <w:p>
+            <w:r>
+              <w:t>Aquí, si queremos agregar pestañas, por ejemplo, podemos integrar otras aplicaciones. Aquí, por ejemplo, YouTube. Agregar. Guardar.</w:t>
             </w:r>
           </w:p>
           <w:p>
             <w:r>
               <w:lastRenderedPageBreak/>
-              <w:t>Aquí, si queremos agregar pestañas, por ejemplo, podemos integrar otras aplicaciones. Aquí, por ejem</w:t>
-            </w:r>
-            <w:r>
-              <w:t>plo, YouTube. Agregar. Guardar.</w:t>
-            </w:r>
-          </w:p>
-          <w:p>
-            <w:r>
               <w:t xml:space="preserve">Miren, </w:t>
             </w:r>
             <w:r>
@@ -9649,6 +9933,246 @@
           <w:lang w:eastAsia="es-CO"/>
         </w:rPr>
         <w:lastRenderedPageBreak/>
+        <w:tab/>
+      </w:r>
+      <w:r>
+        <w:rPr>
+          <w:lang w:eastAsia="es-CO"/>
+        </w:rPr>
+        <w:tab/>
+      </w:r>
+      <w:r>
+        <w:rPr>
+          <w:lang w:eastAsia="es-CO"/>
+        </w:rPr>
+        <w:tab/>
+      </w:r>
+      <w:r>
+        <w:rPr>
+          <w:lang w:eastAsia="es-CO"/>
+        </w:rPr>
+        <w:tab/>
+      </w:r>
+      <w:r>
+        <w:rPr>
+          <w:lang w:eastAsia="es-CO"/>
+        </w:rPr>
+        <w:tab/>
+      </w:r>
+      <w:r>
+        <w:rPr>
+          <w:lang w:eastAsia="es-CO"/>
+        </w:rPr>
+        <w:tab/>
+      </w:r>
+      <w:r>
+        <w:rPr>
+          <w:lang w:eastAsia="es-CO"/>
+        </w:rPr>
+        <w:tab/>
+      </w:r>
+      <w:r>
+        <w:rPr>
+          <w:lang w:eastAsia="es-CO"/>
+        </w:rPr>
+        <w:tab/>
+      </w:r>
+      <w:r>
+        <w:rPr>
+          <w:lang w:eastAsia="es-CO"/>
+        </w:rPr>
+        <w:tab/>
+      </w:r>
+      <w:r>
+        <w:rPr>
+          <w:lang w:eastAsia="es-CO"/>
+        </w:rPr>
+        <w:tab/>
+      </w:r>
+      <w:r>
+        <w:rPr>
+          <w:lang w:eastAsia="es-CO"/>
+        </w:rPr>
+        <w:tab/>
+      </w:r>
+      <w:r>
+        <w:rPr>
+          <w:lang w:eastAsia="es-CO"/>
+        </w:rPr>
+        <w:tab/>
+      </w:r>
+      <w:r>
+        <w:rPr>
+          <w:lang w:eastAsia="es-CO"/>
+        </w:rPr>
+        <w:tab/>
+      </w:r>
+      <w:r>
+        <w:rPr>
+          <w:lang w:eastAsia="es-CO"/>
+        </w:rPr>
+        <w:tab/>
+      </w:r>
+      <w:r>
+        <w:rPr>
+          <w:lang w:eastAsia="es-CO"/>
+        </w:rPr>
+        <w:tab/>
+      </w:r>
+      <w:r>
+        <w:rPr>
+          <w:lang w:eastAsia="es-CO"/>
+        </w:rPr>
+        <w:tab/>
+      </w:r>
+      <w:r>
+        <w:rPr>
+          <w:lang w:eastAsia="es-CO"/>
+        </w:rPr>
+        <w:tab/>
+      </w:r>
+      <w:r>
+        <w:rPr>
+          <w:lang w:eastAsia="es-CO"/>
+        </w:rPr>
+        <w:tab/>
+      </w:r>
+      <w:r>
+        <w:rPr>
+          <w:lang w:eastAsia="es-CO"/>
+        </w:rPr>
+        <w:tab/>
+      </w:r>
+      <w:r>
+        <w:rPr>
+          <w:lang w:eastAsia="es-CO"/>
+        </w:rPr>
+        <w:tab/>
+      </w:r>
+      <w:r>
+        <w:rPr>
+          <w:lang w:eastAsia="es-CO"/>
+        </w:rPr>
+        <w:tab/>
+      </w:r>
+      <w:r>
+        <w:rPr>
+          <w:lang w:eastAsia="es-CO"/>
+        </w:rPr>
+        <w:tab/>
+      </w:r>
+      <w:r>
+        <w:rPr>
+          <w:lang w:eastAsia="es-CO"/>
+        </w:rPr>
+        <w:tab/>
+      </w:r>
+      <w:r>
+        <w:rPr>
+          <w:lang w:eastAsia="es-CO"/>
+        </w:rPr>
+        <w:tab/>
+      </w:r>
+      <w:r>
+        <w:rPr>
+          <w:lang w:eastAsia="es-CO"/>
+        </w:rPr>
+        <w:tab/>
+      </w:r>
+      <w:r>
+        <w:rPr>
+          <w:lang w:eastAsia="es-CO"/>
+        </w:rPr>
+        <w:tab/>
+      </w:r>
+      <w:r>
+        <w:rPr>
+          <w:lang w:eastAsia="es-CO"/>
+        </w:rPr>
+        <w:tab/>
+      </w:r>
+      <w:r>
+        <w:rPr>
+          <w:lang w:eastAsia="es-CO"/>
+        </w:rPr>
+        <w:tab/>
+      </w:r>
+      <w:r>
+        <w:rPr>
+          <w:lang w:eastAsia="es-CO"/>
+        </w:rPr>
+        <w:tab/>
+      </w:r>
+      <w:r>
+        <w:rPr>
+          <w:lang w:eastAsia="es-CO"/>
+        </w:rPr>
+        <w:tab/>
+      </w:r>
+      <w:r>
+        <w:rPr>
+          <w:lang w:eastAsia="es-CO"/>
+        </w:rPr>
+        <w:tab/>
+      </w:r>
+      <w:r>
+        <w:rPr>
+          <w:lang w:eastAsia="es-CO"/>
+        </w:rPr>
+        <w:tab/>
+      </w:r>
+      <w:r>
+        <w:rPr>
+          <w:lang w:eastAsia="es-CO"/>
+        </w:rPr>
+        <w:tab/>
+      </w:r>
+      <w:r>
+        <w:rPr>
+          <w:lang w:eastAsia="es-CO"/>
+        </w:rPr>
+        <w:tab/>
+      </w:r>
+      <w:r>
+        <w:rPr>
+          <w:lang w:eastAsia="es-CO"/>
+        </w:rPr>
+        <w:tab/>
+      </w:r>
+      <w:r>
+        <w:rPr>
+          <w:lang w:eastAsia="es-CO"/>
+        </w:rPr>
+        <w:tab/>
+      </w:r>
+      <w:r>
+        <w:rPr>
+          <w:lang w:eastAsia="es-CO"/>
+        </w:rPr>
+        <w:tab/>
+      </w:r>
+      <w:r>
+        <w:rPr>
+          <w:lang w:eastAsia="es-CO"/>
+        </w:rPr>
+        <w:tab/>
+      </w:r>
+      <w:r>
+        <w:rPr>
+          <w:lang w:eastAsia="es-CO"/>
+        </w:rPr>
+        <w:tab/>
+      </w:r>
+      <w:r>
+        <w:rPr>
+          <w:lang w:eastAsia="es-CO"/>
+        </w:rPr>
+        <w:tab/>
+      </w:r>
+      <w:r>
+        <w:rPr>
+          <w:lang w:eastAsia="es-CO"/>
+        </w:rPr>
         <w:tab/>
       </w:r>
       <w:r>
@@ -11201,7 +11725,7 @@
         <w:spacing w:after="120"/>
         <w:ind w:left="720"/>
       </w:pPr>
-      <w:bookmarkStart w:id="12" w:name="_Toc223093766"/>
+      <w:bookmarkStart w:id="12" w:name="_Toc223942475"/>
       <w:r>
         <w:lastRenderedPageBreak/>
         <w:t>SharePoint</w:t>
@@ -11279,7 +11803,7 @@
       <w:pPr>
         <w:pStyle w:val="Ttulo2"/>
       </w:pPr>
-      <w:bookmarkStart w:id="13" w:name="_Toc223093767"/>
+      <w:bookmarkStart w:id="13" w:name="_Toc223942476"/>
       <w:r>
         <w:t>Propósito</w:t>
       </w:r>
@@ -11390,7 +11914,7 @@
       <w:pPr>
         <w:pStyle w:val="Ttulo2"/>
       </w:pPr>
-      <w:bookmarkStart w:id="14" w:name="_Toc223093768"/>
+      <w:bookmarkStart w:id="14" w:name="_Toc223942477"/>
       <w:r>
         <w:t>Diferencias con OneDrive</w:t>
       </w:r>
@@ -11490,7 +12014,7 @@
       <w:pPr>
         <w:pStyle w:val="Ttulo2"/>
       </w:pPr>
-      <w:bookmarkStart w:id="15" w:name="_Toc223093769"/>
+      <w:bookmarkStart w:id="15" w:name="_Toc223942478"/>
       <w:r>
         <w:t>Organización de archivos en espacios compartidos</w:t>
       </w:r>
@@ -11880,7 +12404,6 @@
                 <w:lang w:eastAsia="es-CO"/>
               </w:rPr>
             </w:pPr>
-            <w:bookmarkStart w:id="16" w:name="_GoBack"/>
             <w:r>
               <w:rPr>
                 <w:b/>
@@ -11888,11 +12411,7 @@
               <w:t>Carpetas:</w:t>
             </w:r>
             <w:r>
-              <w:t xml:space="preserve"> </w:t>
-            </w:r>
-            <w:bookmarkEnd w:id="16"/>
-            <w:r>
-              <w:t>manual de calidad, protocolos de seguridad, reglamentos internos.</w:t>
+              <w:t xml:space="preserve"> manual de calidad, protocolos de seguridad, reglamentos internos.</w:t>
             </w:r>
           </w:p>
         </w:tc>
@@ -11916,11 +12435,11 @@
       <w:pPr>
         <w:pStyle w:val="Ttulo2"/>
       </w:pPr>
-      <w:bookmarkStart w:id="17" w:name="_Toc223093770"/>
+      <w:bookmarkStart w:id="16" w:name="_Toc223942479"/>
       <w:r>
         <w:t>Acceso y permisos de usuarios</w:t>
       </w:r>
-      <w:bookmarkEnd w:id="17"/>
+      <w:bookmarkEnd w:id="16"/>
     </w:p>
     <w:p>
       <w:pPr>
@@ -12414,12 +12933,12 @@
       <w:pPr>
         <w:pStyle w:val="Titulosgenerales"/>
       </w:pPr>
-      <w:bookmarkStart w:id="18" w:name="_Toc223093771"/>
+      <w:bookmarkStart w:id="17" w:name="_Toc223942480"/>
       <w:r>
         <w:lastRenderedPageBreak/>
         <w:t>Síntesis</w:t>
       </w:r>
-      <w:bookmarkEnd w:id="18"/>
+      <w:bookmarkEnd w:id="17"/>
     </w:p>
     <w:p>
       <w:pPr>
@@ -12492,14 +13011,14 @@
       <w:pPr>
         <w:pStyle w:val="Titulosgenerales"/>
       </w:pPr>
-      <w:bookmarkStart w:id="19" w:name="_Toc176443725"/>
-      <w:bookmarkStart w:id="20" w:name="_Toc223093772"/>
+      <w:bookmarkStart w:id="18" w:name="_Toc176443725"/>
+      <w:bookmarkStart w:id="19" w:name="_Toc223942481"/>
       <w:r>
         <w:lastRenderedPageBreak/>
         <w:t>Glosario</w:t>
       </w:r>
+      <w:bookmarkEnd w:id="18"/>
       <w:bookmarkEnd w:id="19"/>
-      <w:bookmarkEnd w:id="20"/>
     </w:p>
     <w:p>
       <w:pPr>
@@ -12518,7 +13037,13 @@
         <w:rPr>
           <w:lang w:eastAsia="es-CO"/>
         </w:rPr>
-        <w:t xml:space="preserve"> capacidad de ingresar y utilizar sistemas, archivos o aplicaciones desde cualquier lugar con conexión a internet, lo que facilita la continuidad de las operaciones y el teletrabajo en entornos empresariales.</w:t>
+        <w:t xml:space="preserve"> capacidad de ingresar y utilizar sistemas, archivos o aplicaciones desde cualquier lugar con conexión a internet, lo que facilita la continuidad de las operaciones y el teletra</w:t>
+      </w:r>
+      <w:r>
+        <w:rPr>
+          <w:lang w:eastAsia="es-CO"/>
+        </w:rPr>
+        <w:t>bajo en entornos empresariales.</w:t>
       </w:r>
     </w:p>
     <w:p>
@@ -12538,7 +13063,13 @@
         <w:rPr>
           <w:lang w:eastAsia="es-CO"/>
         </w:rPr>
-        <w:t xml:space="preserve"> proceso de guardar información en medios electrónicos o en la nube, permitiendo conservar, organizar y acceder fácilmente a los datos sin depender de dispositivos físicos.</w:t>
+        <w:t xml:space="preserve"> proceso de guardar información en medios electrónicos o en la nube, permitiendo conservar, organizar y acceder fácilmente a los datos sin de</w:t>
+      </w:r>
+      <w:r>
+        <w:rPr>
+          <w:lang w:eastAsia="es-CO"/>
+        </w:rPr>
+        <w:t>pender de dispositivos físicos.</w:t>
       </w:r>
     </w:p>
     <w:p>
@@ -12558,7 +13089,13 @@
         <w:rPr>
           <w:lang w:eastAsia="es-CO"/>
         </w:rPr>
-        <w:t xml:space="preserve"> se refiere al uso de herramientas y tecnologías en línea que permiten a varios usuarios trabajar juntos, compartir información y desarrollar proyectos de forma simultánea y remota.</w:t>
+        <w:t xml:space="preserve"> se refiere al uso de herramientas y tecnologías en línea que permiten a varios usuarios trabajar juntos, compartir información y desarrollar proyecto</w:t>
+      </w:r>
+      <w:r>
+        <w:rPr>
+          <w:lang w:eastAsia="es-CO"/>
+        </w:rPr>
+        <w:t>s de forma simultánea y remota.</w:t>
       </w:r>
     </w:p>
     <w:p>
@@ -12572,26 +13109,153 @@
           <w:b/>
           <w:lang w:eastAsia="es-CO"/>
         </w:rPr>
-        <w:t>Gobernanza</w:t>
-      </w:r>
+        <w:t>Gobernanza:</w:t>
+      </w:r>
+      <w:r>
+        <w:rPr>
+          <w:lang w:eastAsia="es-CO"/>
+        </w:rPr>
+        <w:t xml:space="preserve"> hace referencia al conjunto de políticas, normas y procedimientos que garantizan el uso adecuado, seguro y eficiente de los recursos y datos dentro de una organiz</w:t>
+      </w:r>
+      <w:r>
+        <w:rPr>
+          <w:lang w:eastAsia="es-CO"/>
+        </w:rPr>
+        <w:t>ación o plataforma tecnológica.</w:t>
+      </w:r>
+    </w:p>
+    <w:p>
+      <w:pPr>
+        <w:rPr>
+          <w:lang w:eastAsia="es-CO"/>
+        </w:rPr>
+      </w:pPr>
       <w:r>
         <w:rPr>
           <w:b/>
           <w:lang w:eastAsia="es-CO"/>
         </w:rPr>
+        <w:t>Microsoft 365:</w:t>
+      </w:r>
+      <w:r>
+        <w:rPr>
+          <w:lang w:eastAsia="es-CO"/>
+        </w:rPr>
+        <w:t xml:space="preserve"> plataforma en línea de Microsoft que integra herramientas como Word, Excel, PowerPoint, Outlook y OneDrive, orientadas a la productividad, cola</w:t>
+      </w:r>
+      <w:r>
+        <w:rPr>
+          <w:lang w:eastAsia="es-CO"/>
+        </w:rPr>
+        <w:t>boración y gestión empresarial.</w:t>
+      </w:r>
+    </w:p>
+    <w:p>
+      <w:pPr>
+        <w:rPr>
+          <w:lang w:eastAsia="es-CO"/>
+        </w:rPr>
+      </w:pPr>
+      <w:r>
+        <w:rPr>
+          <w:b/>
+          <w:lang w:eastAsia="es-CO"/>
+        </w:rPr>
+        <w:t>Productividad organizacional:</w:t>
+      </w:r>
+      <w:r>
+        <w:rPr>
+          <w:lang w:eastAsia="es-CO"/>
+        </w:rPr>
+        <w:t xml:space="preserve"> capacidad de una empresa para optimizar sus recursos humanos y tecnológicos con el fin de alcanzar metas de manera eficiente y con resultados</w:t>
+      </w:r>
+      <w:r>
+        <w:rPr>
+          <w:lang w:eastAsia="es-CO"/>
+        </w:rPr>
+        <w:t xml:space="preserve"> sostenibles.</w:t>
+      </w:r>
+    </w:p>
+    <w:p>
+      <w:pPr>
+        <w:rPr>
+          <w:lang w:eastAsia="es-CO"/>
+        </w:rPr>
+      </w:pPr>
+      <w:r>
+        <w:rPr>
+          <w:b/>
+          <w:lang w:eastAsia="es-CO"/>
+        </w:rPr>
+        <w:t>SharePoint:</w:t>
+      </w:r>
+      <w:r>
+        <w:rPr>
+          <w:lang w:eastAsia="es-CO"/>
+        </w:rPr>
+        <w:t xml:space="preserve"> es una herramienta de Microsoft 365 que facilita la creación de sitios web, intranets y espacios colaborativos para gestionar, compartir y proteger </w:t>
+      </w:r>
+      <w:r>
+        <w:rPr>
+          <w:lang w:eastAsia="es-CO"/>
+        </w:rPr>
+        <w:lastRenderedPageBreak/>
+        <w:t>documentos e información de manera centralizada y segura dentro de una organizaci</w:t>
+      </w:r>
+      <w:r>
+        <w:rPr>
+          <w:lang w:eastAsia="es-CO"/>
+        </w:rPr>
+        <w:t>ón.</w:t>
+      </w:r>
+    </w:p>
+    <w:p>
+      <w:pPr>
+        <w:rPr>
+          <w:lang w:eastAsia="es-CO"/>
+        </w:rPr>
+      </w:pPr>
+      <w:proofErr w:type="spellStart"/>
+      <w:r>
+        <w:rPr>
+          <w:b/>
+          <w:lang w:eastAsia="es-CO"/>
+        </w:rPr>
+        <w:t>Teams</w:t>
+      </w:r>
+      <w:proofErr w:type="spellEnd"/>
+      <w:r>
+        <w:rPr>
+          <w:b/>
+          <w:lang w:eastAsia="es-CO"/>
+        </w:rPr>
         <w:t>:</w:t>
       </w:r>
       <w:r>
         <w:rPr>
           <w:lang w:eastAsia="es-CO"/>
         </w:rPr>
-        <w:t xml:space="preserve"> h</w:t>
-      </w:r>
-      <w:r>
-        <w:rPr>
-          <w:lang w:eastAsia="es-CO"/>
-        </w:rPr>
-        <w:t>ace referencia al conjunto de políticas, normas y procedimientos que garantizan el uso adecuado, seguro y eficiente de los recursos y datos dentro de una organización o plataforma tecnológica.</w:t>
+        <w:t xml:space="preserve"> es una plataforma de comunicación y colaboración de Microsoft 365 que integra chat, </w:t>
+      </w:r>
+      <w:proofErr w:type="spellStart"/>
+      <w:r>
+        <w:rPr>
+          <w:lang w:eastAsia="es-CO"/>
+        </w:rPr>
+        <w:t>videollamadas</w:t>
+      </w:r>
+      <w:proofErr w:type="spellEnd"/>
+      <w:r>
+        <w:rPr>
+          <w:lang w:eastAsia="es-CO"/>
+        </w:rPr>
+        <w:t>, reuniones, almacenamiento de archivos y aplicaciones, permitiendo el trabajo en equipo en tiempo real dentro de entornos empresariales y educativ</w:t>
+      </w:r>
+      <w:r>
+        <w:rPr>
+          <w:lang w:eastAsia="es-CO"/>
+        </w:rPr>
+        <w:t>os.</w:t>
       </w:r>
     </w:p>
     <w:p>
@@ -12605,26 +13269,45 @@
           <w:b/>
           <w:lang w:eastAsia="es-CO"/>
         </w:rPr>
-        <w:t>Microsoft 365</w:t>
-      </w:r>
+        <w:t>Trabajo colaborativo:</w:t>
+      </w:r>
+      <w:r>
+        <w:rPr>
+          <w:lang w:eastAsia="es-CO"/>
+        </w:rPr>
+        <w:t xml:space="preserve"> modalidad de organización en la que varias personas contribuyen con sus habilidades y conocimientos para alcanzar objetivos comunes, aprovechando herrami</w:t>
+      </w:r>
+      <w:r>
+        <w:rPr>
+          <w:lang w:eastAsia="es-CO"/>
+        </w:rPr>
+        <w:t>entas tecnológicas compartidas.</w:t>
+      </w:r>
+    </w:p>
+    <w:p>
+      <w:pPr>
+        <w:rPr>
+          <w:lang w:eastAsia="es-CO"/>
+        </w:rPr>
+      </w:pPr>
       <w:r>
         <w:rPr>
           <w:b/>
           <w:lang w:eastAsia="es-CO"/>
         </w:rPr>
-        <w:t>:</w:t>
-      </w:r>
-      <w:r>
-        <w:rPr>
-          <w:lang w:eastAsia="es-CO"/>
-        </w:rPr>
-        <w:t xml:space="preserve"> p</w:t>
-      </w:r>
-      <w:r>
-        <w:rPr>
-          <w:lang w:eastAsia="es-CO"/>
-        </w:rPr>
-        <w:t>lataforma en línea de Microsoft que integra herramientas como Word, Excel, PowerPoint, Outlook y OneDrive, orientadas a la productividad, colaboración y gestión empresarial.</w:t>
+        <w:t>Trabajo en equipo:</w:t>
+      </w:r>
+      <w:r>
+        <w:rPr>
+          <w:lang w:eastAsia="es-CO"/>
+        </w:rPr>
+        <w:t xml:space="preserve"> es la acción coordinada de varias personas que aportan sus habilidades, conocimientos y esfuerzos para alcanzar un objetivo común, fomentando la comunicación</w:t>
+      </w:r>
+      <w:r>
+        <w:rPr>
+          <w:lang w:eastAsia="es-CO"/>
+        </w:rPr>
+        <w:t>, la confianza y la eficiencia.</w:t>
       </w:r>
     </w:p>
     <w:p>
@@ -12638,275 +13321,40 @@
           <w:b/>
           <w:lang w:eastAsia="es-CO"/>
         </w:rPr>
-        <w:t>Productividad organizacional</w:t>
-      </w:r>
+        <w:t>Transformación digital:</w:t>
+      </w:r>
+      <w:r>
+        <w:rPr>
+          <w:lang w:eastAsia="es-CO"/>
+        </w:rPr>
+        <w:t xml:space="preserve"> proceso mediante el cual las organizaciones integran tecnologías digitales en sus operaciones, modificando su estructura, cultura y modelos de negocio para </w:t>
+      </w:r>
+      <w:r>
+        <w:rPr>
+          <w:lang w:eastAsia="es-CO"/>
+        </w:rPr>
+        <w:t>innovar y mejorar su desempeño.</w:t>
+      </w:r>
+    </w:p>
+    <w:p>
+      <w:pPr>
+        <w:rPr>
+          <w:lang w:eastAsia="es-CO"/>
+        </w:rPr>
+      </w:pPr>
       <w:r>
         <w:rPr>
           <w:b/>
           <w:lang w:eastAsia="es-CO"/>
         </w:rPr>
-        <w:t>:</w:t>
-      </w:r>
-      <w:r>
-        <w:rPr>
-          <w:lang w:eastAsia="es-CO"/>
-        </w:rPr>
-        <w:t xml:space="preserve"> c</w:t>
-      </w:r>
-      <w:r>
-        <w:rPr>
-          <w:lang w:eastAsia="es-CO"/>
-        </w:rPr>
-        <w:t>apacidad de una empresa para optimizar sus recursos humanos y tecnológicos con el fin de alcanzar metas de manera eficiente y con resultados sostenibles.</w:t>
-      </w:r>
-    </w:p>
-    <w:p>
-      <w:pPr>
-        <w:rPr>
-          <w:lang w:eastAsia="es-CO"/>
-        </w:rPr>
-      </w:pPr>
-      <w:r>
-        <w:rPr>
-          <w:b/>
-          <w:lang w:eastAsia="es-CO"/>
-        </w:rPr>
-        <w:t>SharePoint</w:t>
-      </w:r>
-      <w:r>
-        <w:rPr>
-          <w:b/>
-          <w:lang w:eastAsia="es-CO"/>
-        </w:rPr>
-        <w:t>:</w:t>
-      </w:r>
-      <w:r>
-        <w:rPr>
-          <w:lang w:eastAsia="es-CO"/>
-        </w:rPr>
-        <w:tab/>
-        <w:t>e</w:t>
-      </w:r>
-      <w:r>
-        <w:rPr>
-          <w:lang w:eastAsia="es-CO"/>
-        </w:rPr>
-        <w:t xml:space="preserve">s una herramienta de Microsoft 365 que facilita la creación de sitios web, intranets y espacios colaborativos para gestionar, compartir y proteger </w:t>
-      </w:r>
-      <w:r>
-        <w:rPr>
-          <w:lang w:eastAsia="es-CO"/>
-        </w:rPr>
-        <w:lastRenderedPageBreak/>
-        <w:t>documentos e información de manera centralizada y segura dentro de una organización.</w:t>
-      </w:r>
-    </w:p>
-    <w:p>
-      <w:pPr>
-        <w:rPr>
-          <w:lang w:eastAsia="es-CO"/>
-        </w:rPr>
-      </w:pPr>
-      <w:r>
-        <w:rPr>
-          <w:b/>
-          <w:lang w:eastAsia="es-CO"/>
-        </w:rPr>
-        <w:t>Productividad organizacional</w:t>
-      </w:r>
-      <w:r>
-        <w:rPr>
-          <w:b/>
-          <w:lang w:eastAsia="es-CO"/>
-        </w:rPr>
-        <w:t>:</w:t>
-      </w:r>
-      <w:r>
-        <w:rPr>
-          <w:lang w:eastAsia="es-CO"/>
-        </w:rPr>
-        <w:t xml:space="preserve"> c</w:t>
-      </w:r>
-      <w:r>
-        <w:rPr>
-          <w:lang w:eastAsia="es-CO"/>
-        </w:rPr>
-        <w:t>apacidad de una empresa para optimizar sus recursos humanos y tecnológicos con el fin de alcanzar metas de manera eficiente y con resultados sostenibles.</w:t>
-      </w:r>
-    </w:p>
-    <w:p>
-      <w:pPr>
-        <w:rPr>
-          <w:lang w:eastAsia="es-CO"/>
-        </w:rPr>
-      </w:pPr>
-      <w:r>
-        <w:rPr>
-          <w:b/>
-          <w:lang w:eastAsia="es-CO"/>
-        </w:rPr>
-        <w:t>Teams</w:t>
-      </w:r>
-      <w:r>
-        <w:rPr>
-          <w:b/>
-          <w:lang w:eastAsia="es-CO"/>
-        </w:rPr>
-        <w:t>:</w:t>
-      </w:r>
-      <w:r>
-        <w:rPr>
-          <w:lang w:eastAsia="es-CO"/>
-        </w:rPr>
-        <w:t xml:space="preserve"> e</w:t>
-      </w:r>
-      <w:r>
-        <w:rPr>
-          <w:lang w:eastAsia="es-CO"/>
-        </w:rPr>
-        <w:t>s una plataforma de comunicación y colaboración de Microsoft 365 que integra chat, videollamadas, reuniones, almacenamiento de archivos y aplicaciones, permitiendo el trabajo en equipo en tiempo real dentro de entornos empresariales y educativos.</w:t>
-      </w:r>
-    </w:p>
-    <w:p>
-      <w:pPr>
-        <w:rPr>
-          <w:lang w:eastAsia="es-CO"/>
-        </w:rPr>
-      </w:pPr>
-      <w:r>
-        <w:rPr>
-          <w:b/>
-          <w:lang w:eastAsia="es-CO"/>
-        </w:rPr>
-        <w:t>Trabajo colaborativo</w:t>
-      </w:r>
-      <w:r>
-        <w:rPr>
-          <w:b/>
-          <w:lang w:eastAsia="es-CO"/>
-        </w:rPr>
-        <w:t>:</w:t>
-      </w:r>
-      <w:r>
-        <w:rPr>
-          <w:lang w:eastAsia="es-CO"/>
-        </w:rPr>
-        <w:t xml:space="preserve"> m</w:t>
-      </w:r>
-      <w:r>
-        <w:rPr>
-          <w:lang w:eastAsia="es-CO"/>
-        </w:rPr>
-        <w:t>odalidad de organización en la que varias personas contribuyen con sus habilidades y conocimientos para alcanzar objetivos comunes, aprovechando herramientas tecnológicas compartidas.</w:t>
-      </w:r>
-    </w:p>
-    <w:p>
-      <w:pPr>
-        <w:rPr>
-          <w:lang w:eastAsia="es-CO"/>
-        </w:rPr>
-      </w:pPr>
-      <w:r>
-        <w:rPr>
-          <w:b/>
-          <w:lang w:eastAsia="es-CO"/>
-        </w:rPr>
-        <w:t>Trabajo en equipo</w:t>
-      </w:r>
-      <w:r>
-        <w:rPr>
-          <w:b/>
-          <w:lang w:eastAsia="es-CO"/>
-        </w:rPr>
-        <w:t>:</w:t>
-      </w:r>
-      <w:r>
-        <w:rPr>
-          <w:lang w:eastAsia="es-CO"/>
-        </w:rPr>
-        <w:t xml:space="preserve"> e</w:t>
-      </w:r>
-      <w:r>
-        <w:rPr>
-          <w:lang w:eastAsia="es-CO"/>
-        </w:rPr>
-        <w:t>s la acción coordinada de varias personas que aportan sus habilidades, conocimientos y esfuerzos para alcanzar un objetivo común, fomentando la comunicación, la confianza y la eficiencia.</w:t>
-      </w:r>
-    </w:p>
-    <w:p>
-      <w:pPr>
-        <w:rPr>
-          <w:lang w:eastAsia="es-CO"/>
-        </w:rPr>
-      </w:pPr>
-      <w:r>
-        <w:rPr>
-          <w:b/>
-          <w:lang w:eastAsia="es-CO"/>
-        </w:rPr>
-        <w:t>Transformación digital</w:t>
-      </w:r>
-      <w:r>
-        <w:rPr>
-          <w:b/>
-          <w:lang w:eastAsia="es-CO"/>
-        </w:rPr>
-        <w:t>:</w:t>
-      </w:r>
-      <w:r>
-        <w:rPr>
-          <w:lang w:eastAsia="es-CO"/>
-        </w:rPr>
-        <w:t xml:space="preserve"> p</w:t>
-      </w:r>
-      <w:r>
-        <w:rPr>
-          <w:lang w:eastAsia="es-CO"/>
-        </w:rPr>
-        <w:t>roceso mediante el cual las organizaciones integran tecnologías digitales en sus operaciones, modificando su estructura, cultura y modelos de negocio para innovar y mejorar su desempeño.</w:t>
-      </w:r>
-    </w:p>
-    <w:p>
-      <w:pPr>
-        <w:rPr>
-          <w:b/>
-          <w:lang w:eastAsia="es-CO"/>
-        </w:rPr>
-      </w:pPr>
-      <w:r>
-        <w:rPr>
-          <w:b/>
-          <w:lang w:eastAsia="es-CO"/>
-        </w:rPr>
-        <w:t>Usuarios</w:t>
-      </w:r>
-      <w:r>
-        <w:rPr>
-          <w:b/>
-          <w:lang w:eastAsia="es-CO"/>
-        </w:rPr>
-        <w:t>:</w:t>
-      </w:r>
-      <w:r>
-        <w:rPr>
-          <w:lang w:eastAsia="es-CO"/>
-        </w:rPr>
-        <w:t xml:space="preserve"> s</w:t>
-      </w:r>
-      <w:r>
-        <w:rPr>
-          <w:lang w:eastAsia="es-CO"/>
-        </w:rPr>
-        <w:t>on las personas que interactúan con plataformas digitales o sistemas informáticos, accediendo a servicios, funciones o contenidos según los permisos que les sean otorgados por la organización o el administrador del sistema.</w:t>
-      </w:r>
-    </w:p>
-    <w:p>
-      <w:pPr>
-        <w:ind w:firstLine="0"/>
-        <w:rPr>
-          <w:lang w:eastAsia="es-CO"/>
-        </w:rPr>
-      </w:pPr>
+        <w:t>Usuarios:</w:t>
+      </w:r>
+      <w:r>
+        <w:rPr>
+          <w:lang w:eastAsia="es-CO"/>
+        </w:rPr>
+        <w:t xml:space="preserve"> son las personas que interactúan con plataformas digitales o sistemas informáticos, accediendo a servicios, funciones o contenidos según los permisos que les sean otorgados por la organización o el administrador del sistema.</w:t>
+      </w:r>
     </w:p>
     <w:p>
       <w:pPr>
@@ -12915,8 +13363,8 @@
           <w:lang w:val="es-MX"/>
         </w:rPr>
       </w:pPr>
-      <w:bookmarkStart w:id="21" w:name="_Toc176443726"/>
-      <w:bookmarkStart w:id="22" w:name="_Toc223093773"/>
+      <w:bookmarkStart w:id="20" w:name="_Toc176443726"/>
+      <w:bookmarkStart w:id="21" w:name="_Toc223942482"/>
       <w:r>
         <w:rPr>
           <w:lang w:val="es-MX"/>
@@ -12924,8 +13372,8 @@
         <w:lastRenderedPageBreak/>
         <w:t>Referencias bibliográficas</w:t>
       </w:r>
+      <w:bookmarkEnd w:id="20"/>
       <w:bookmarkEnd w:id="21"/>
-      <w:bookmarkEnd w:id="22"/>
     </w:p>
     <w:p>
       <w:pPr>
@@ -13279,14 +13727,14 @@
       <w:pPr>
         <w:pStyle w:val="Titulosgenerales"/>
       </w:pPr>
-      <w:bookmarkStart w:id="23" w:name="_Toc176443727"/>
-      <w:bookmarkStart w:id="24" w:name="_Toc223093774"/>
+      <w:bookmarkStart w:id="22" w:name="_Toc176443727"/>
+      <w:bookmarkStart w:id="23" w:name="_Toc223942483"/>
       <w:r>
         <w:lastRenderedPageBreak/>
         <w:t>Créditos</w:t>
       </w:r>
+      <w:bookmarkEnd w:id="22"/>
       <w:bookmarkEnd w:id="23"/>
-      <w:bookmarkEnd w:id="24"/>
     </w:p>
     <w:tbl>
       <w:tblPr>
@@ -13400,13 +13848,8 @@
                 <w:lang w:val="es-ES" w:eastAsia="es-CO"/>
               </w:rPr>
             </w:pPr>
-            <w:proofErr w:type="spellStart"/>
-            <w:r>
-              <w:t>Milady</w:t>
-            </w:r>
-            <w:proofErr w:type="spellEnd"/>
-            <w:r>
-              <w:t xml:space="preserve"> Tatiana Villamil Castellanos</w:t>
+            <w:r>
+              <w:t>Claudia Johanna Gómez Pérez</w:t>
             </w:r>
           </w:p>
         </w:tc>
@@ -13467,7 +13910,7 @@
               </w:rPr>
             </w:pPr>
             <w:r>
-              <w:t>Claudia Johanna Gómez Pérez</w:t>
+              <w:t>Edison Eduardo Mantilla Cuadros</w:t>
             </w:r>
           </w:p>
         </w:tc>
@@ -13981,7 +14424,12 @@
               </w:rPr>
             </w:pPr>
             <w:r>
-              <w:t>Evaluadora para contenidos inclusivos y accesibles</w:t>
+              <w:t xml:space="preserve">Evaluadora de </w:t>
+            </w:r>
+            <w:bookmarkStart w:id="24" w:name="_GoBack"/>
+            <w:bookmarkEnd w:id="24"/>
+            <w:r>
+              <w:t>contenidos inclusivos y accesibles</w:t>
             </w:r>
           </w:p>
         </w:tc>
@@ -17605,6 +18053,17 @@
 </file>
 
 <file path=customXml/item1.xml><?xml version="1.0" encoding="utf-8"?>
+<p:properties xmlns:p="http://schemas.microsoft.com/office/2006/metadata/properties" xmlns:xsi="http://www.w3.org/2001/XMLSchema-instance" xmlns:pc="http://schemas.microsoft.com/office/infopath/2007/PartnerControls">
+  <documentManagement>
+    <TaxCatchAll xmlns="285d351f-f218-493a-825f-85a9dfbde315" xsi:nil="true"/>
+    <lcf76f155ced4ddcb4097134ff3c332f xmlns="55abea07-cd72-4a95-add0-1082a24cf9e9">
+      <Terms xmlns="http://schemas.microsoft.com/office/infopath/2007/PartnerControls"/>
+    </lcf76f155ced4ddcb4097134ff3c332f>
+  </documentManagement>
+</p:properties>
+</file>
+
+<file path=customXml/item2.xml><?xml version="1.0" encoding="utf-8"?>
 <ct:contentTypeSchema xmlns:ct="http://schemas.microsoft.com/office/2006/metadata/contentType" xmlns:ma="http://schemas.microsoft.com/office/2006/metadata/properties/metaAttributes" ct:_="" ma:_="" ma:contentTypeName="Documento" ma:contentTypeID="0x0101005D7421CBAB376F47AC1876466873BE0C" ma:contentTypeVersion="11" ma:contentTypeDescription="Crear nuevo documento." ma:contentTypeScope="" ma:versionID="f360f8b6fb6f4c8bd21c6a7e407e2e16">
   <xsd:schema xmlns:xsd="http://www.w3.org/2001/XMLSchema" xmlns:xs="http://www.w3.org/2001/XMLSchema" xmlns:p="http://schemas.microsoft.com/office/2006/metadata/properties" xmlns:ns2="55abea07-cd72-4a95-add0-1082a24cf9e9" xmlns:ns3="285d351f-f218-493a-825f-85a9dfbde315" targetNamespace="http://schemas.microsoft.com/office/2006/metadata/properties" ma:root="true" ma:fieldsID="45e32b76c8e436055369618aac27ad35" ns2:_="" ns3:_="">
     <xsd:import namespace="55abea07-cd72-4a95-add0-1082a24cf9e9"/>
@@ -17799,17 +18258,6 @@
 </ct:contentTypeSchema>
 </file>
 
-<file path=customXml/item2.xml><?xml version="1.0" encoding="utf-8"?>
-<p:properties xmlns:p="http://schemas.microsoft.com/office/2006/metadata/properties" xmlns:xsi="http://www.w3.org/2001/XMLSchema-instance" xmlns:pc="http://schemas.microsoft.com/office/infopath/2007/PartnerControls">
-  <documentManagement>
-    <TaxCatchAll xmlns="285d351f-f218-493a-825f-85a9dfbde315" xsi:nil="true"/>
-    <lcf76f155ced4ddcb4097134ff3c332f xmlns="55abea07-cd72-4a95-add0-1082a24cf9e9">
-      <Terms xmlns="http://schemas.microsoft.com/office/infopath/2007/PartnerControls"/>
-    </lcf76f155ced4ddcb4097134ff3c332f>
-  </documentManagement>
-</p:properties>
-</file>
-
 <file path=customXml/item3.xml><?xml version="1.0" encoding="utf-8"?>
 <?mso-contentType ?>
 <FormTemplates xmlns="http://schemas.microsoft.com/sharepoint/v3/contenttype/forms">
@@ -17824,10 +18272,6 @@
 </file>
 
 <file path=customXml/itemProps1.xml><?xml version="1.0" encoding="utf-8"?>
-<ds:datastoreItem xmlns:ds="http://schemas.openxmlformats.org/officeDocument/2006/customXml" ds:itemID="{28119E53-FA3A-47CF-AD5A-F739F5CDF31E}"/>
-</file>
-
-<file path=customXml/itemProps2.xml><?xml version="1.0" encoding="utf-8"?>
 <ds:datastoreItem xmlns:ds="http://schemas.openxmlformats.org/officeDocument/2006/customXml" ds:itemID="{CEECB56F-E1D8-45BF-A0A3-B5258E7263D4}">
   <ds:schemaRefs>
     <ds:schemaRef ds:uri="http://schemas.microsoft.com/office/2006/metadata/properties"/>
@@ -17836,6 +18280,10 @@
     <ds:schemaRef ds:uri="2b6b437a-5846-4934-ac66-7de06297595b"/>
   </ds:schemaRefs>
 </ds:datastoreItem>
+</file>
+
+<file path=customXml/itemProps2.xml><?xml version="1.0" encoding="utf-8"?>
+<ds:datastoreItem xmlns:ds="http://schemas.openxmlformats.org/officeDocument/2006/customXml" ds:itemID="{CBFD772D-98D8-4CED-8B6A-937348A2E8D2}"/>
 </file>
 
 <file path=customXml/itemProps3.xml><?xml version="1.0" encoding="utf-8"?>
@@ -17847,7 +18295,7 @@
 </file>
 
 <file path=customXml/itemProps4.xml><?xml version="1.0" encoding="utf-8"?>
-<ds:datastoreItem xmlns:ds="http://schemas.openxmlformats.org/officeDocument/2006/customXml" ds:itemID="{982CB28D-4D35-4CFC-9E8D-C74D60D0A25F}">
+<ds:datastoreItem xmlns:ds="http://schemas.openxmlformats.org/officeDocument/2006/customXml" ds:itemID="{9D20B51E-0B9F-4C78-8D0F-DADA33FAFCF9}">
   <ds:schemaRefs>
     <ds:schemaRef ds:uri="http://schemas.openxmlformats.org/officeDocument/2006/bibliography"/>
   </ds:schemaRefs>

</xml_diff>